<commit_message>
Update KHDH and Ke hoach to chuyen mon THCS with Tiet 0, Tin hoc & Robotics
</commit_message>
<xml_diff>
--- a/Hệ thống mẫu văn bản/Nguyên đã làm/Kế hoạch dạy học Robotics từng lớp/Kế hoạch dạy học môn Robotics - Lớp 5 - 2026 - 2027.docx
+++ b/Hệ thống mẫu văn bản/Nguyên đã làm/Kế hoạch dạy học Robotics từng lớp/Kế hoạch dạy học môn Robotics - Lớp 5 - 2026 - 2027.docx
@@ -18,6 +18,7 @@
         <w:rPr>
           <w:rFonts w:ascii="Times New Roman" w:hAnsi="Times New Roman"/>
           <w:sz w:val="26"/>
+          <w:rFonts w:ascii="Times New Roman" w:hAnsi="Times New Roman" w:cs="Times New Roman"/>
         </w:rPr>
         <w:t>Phụ lục 1</w:t>
       </w:r>
@@ -36,6 +37,7 @@
           <w:b/>
           <w:bCs/>
           <w:sz w:val="26"/>
+          <w:rFonts w:ascii="Times New Roman" w:hAnsi="Times New Roman" w:cs="Times New Roman"/>
         </w:rPr>
         <w:t>KHUNG KẾ HOẠCH DẠY HỌC MÔN</w:t>
       </w:r>
@@ -45,6 +47,7 @@
           <w:b/>
           <w:bCs/>
           <w:sz w:val="26"/>
+          <w:rFonts w:ascii="Times New Roman" w:hAnsi="Times New Roman" w:cs="Times New Roman"/>
         </w:rPr>
         <w:t xml:space="preserve"> ROBOTICS</w:t>
       </w:r>
@@ -60,6 +63,7 @@
         <w:rPr>
           <w:rFonts w:ascii="Times New Roman" w:hAnsi="Times New Roman"/>
           <w:sz w:val="26"/>
+          <w:rFonts w:ascii="Times New Roman" w:hAnsi="Times New Roman" w:cs="Times New Roman"/>
         </w:rPr>
         <w:t>(</w:t>
       </w:r>
@@ -69,6 +73,7 @@
           <w:i/>
           <w:iCs/>
           <w:sz w:val="26"/>
+          <w:rFonts w:ascii="Times New Roman" w:hAnsi="Times New Roman" w:cs="Times New Roman"/>
         </w:rPr>
         <w:t>Kèm theo Công văn số 5512/BGDĐT-GDTrH ngày 18 tháng 12 năm 2022 của Bộ GDĐT)</w:t>
       </w:r>
@@ -111,6 +116,7 @@
                 <w:rFonts w:ascii="Times New Roman" w:eastAsia="Times New Roman" w:hAnsi="Times New Roman" w:cs="Times New Roman"/>
                 <w:sz w:val="26"/>
                 <w:szCs w:val="26"/>
+                <w:rFonts w:ascii="Times New Roman" w:hAnsi="Times New Roman" w:cs="Times New Roman"/>
               </w:rPr>
               <w:t xml:space="preserve">TRƯỜNG: </w:t>
             </w:r>
@@ -128,6 +134,7 @@
                 <w:rFonts w:ascii="Times New Roman" w:eastAsia="Times New Roman" w:hAnsi="Times New Roman" w:cs="Times New Roman"/>
                 <w:sz w:val="26"/>
                 <w:szCs w:val="26"/>
+                <w:rFonts w:ascii="Times New Roman" w:hAnsi="Times New Roman" w:cs="Times New Roman"/>
               </w:rPr>
               <w:t>Tiểu học &amp; THCS UNIGO</w:t>
             </w:r>
@@ -147,6 +154,7 @@
                 <w:sz w:val="26"/>
                 <w:szCs w:val="26"/>
                 <w:u w:val="single"/>
+                <w:rFonts w:ascii="Times New Roman" w:hAnsi="Times New Roman" w:cs="Times New Roman"/>
               </w:rPr>
               <w:t>TỔ:</w:t>
             </w:r>
@@ -156,6 +164,7 @@
                 <w:sz w:val="26"/>
                 <w:szCs w:val="26"/>
                 <w:u w:val="single"/>
+                <w:rFonts w:ascii="Times New Roman" w:hAnsi="Times New Roman" w:cs="Times New Roman"/>
               </w:rPr>
               <w:t xml:space="preserve"> </w:t>
             </w:r>
@@ -164,6 +173,7 @@
                 <w:rFonts w:ascii="Times New Roman" w:eastAsia="Times New Roman" w:hAnsi="Times New Roman" w:cs="Times New Roman"/>
                 <w:sz w:val="26"/>
                 <w:szCs w:val="26"/>
+                <w:rFonts w:ascii="Times New Roman" w:hAnsi="Times New Roman" w:cs="Times New Roman"/>
               </w:rPr>
               <w:t>Robotics</w:t>
             </w:r>
@@ -187,6 +197,7 @@
                 <w:rFonts w:ascii="Times New Roman" w:eastAsia="Times New Roman" w:hAnsi="Times New Roman" w:cs="Times New Roman"/>
                 <w:sz w:val="26"/>
                 <w:szCs w:val="26"/>
+                <w:rFonts w:ascii="Times New Roman" w:hAnsi="Times New Roman" w:cs="Times New Roman"/>
               </w:rPr>
               <w:t>CỘNG HOÀ XÃ HỘI CHỦ NGHĨA VIỆT NAM</w:t>
             </w:r>
@@ -211,6 +222,7 @@
                 <w:sz w:val="26"/>
                 <w:szCs w:val="26"/>
                 <w:u w:val="single"/>
+                <w:rFonts w:ascii="Times New Roman" w:hAnsi="Times New Roman" w:cs="Times New Roman"/>
               </w:rPr>
               <w:t>Độc lập- Tự do-Hạnh phúc</w:t>
             </w:r>
@@ -271,6 +283,7 @@
           <w:b/>
           <w:bCs/>
           <w:sz w:val="26"/>
+          <w:rFonts w:ascii="Times New Roman" w:hAnsi="Times New Roman" w:cs="Times New Roman"/>
         </w:rPr>
         <w:t>KẾ HOẠCH DẠY HỌC</w:t>
       </w:r>
@@ -287,6 +300,7 @@
         <w:rPr>
           <w:rFonts w:ascii="Times New Roman" w:hAnsi="Times New Roman"/>
           <w:sz w:val="26"/>
+          <w:rFonts w:ascii="Times New Roman" w:hAnsi="Times New Roman" w:cs="Times New Roman"/>
         </w:rPr>
         <w:t>MÔN HỌC/HOẠT ĐỘNG GIÁO DỤC ROBOTICS LỚP 5</w:t>
       </w:r>
@@ -299,6 +313,7 @@
         <w:rPr>
           <w:rFonts w:ascii="Times New Roman" w:hAnsi="Times New Roman"/>
           <w:sz w:val="26"/>
+          <w:rFonts w:ascii="Times New Roman" w:hAnsi="Times New Roman" w:cs="Times New Roman"/>
         </w:rPr>
         <w:t>(Năm học 2026-2027)</w:t>
       </w:r>
@@ -316,6 +331,7 @@
           <w:b/>
           <w:bCs/>
           <w:sz w:val="26"/>
+          <w:rFonts w:ascii="Times New Roman" w:hAnsi="Times New Roman" w:cs="Times New Roman"/>
         </w:rPr>
         <w:t>I. Đặc điểm tình hình</w:t>
       </w:r>
@@ -333,6 +349,7 @@
           <w:b/>
           <w:bCs/>
           <w:sz w:val="26"/>
+          <w:rFonts w:ascii="Times New Roman" w:hAnsi="Times New Roman" w:cs="Times New Roman"/>
         </w:rPr>
         <w:t>1. Số lớp………; Số học sinh:……;Số học sinh học chuyên đề lựa chọn (Nếu có):……</w:t>
       </w:r>
@@ -350,6 +367,7 @@
           <w:b/>
           <w:bCs/>
           <w:sz w:val="26"/>
+          <w:rFonts w:ascii="Times New Roman" w:hAnsi="Times New Roman" w:cs="Times New Roman"/>
         </w:rPr>
         <w:t>2. Tình hình đội ngũ:</w:t>
       </w:r>
@@ -364,6 +382,7 @@
           <w:b/>
           <w:bCs/>
           <w:sz w:val="26"/>
+          <w:rFonts w:ascii="Times New Roman" w:hAnsi="Times New Roman" w:cs="Times New Roman"/>
         </w:rPr>
         <w:t xml:space="preserve">- </w:t>
       </w:r>
@@ -371,6 +390,7 @@
         <w:rPr>
           <w:rFonts w:ascii="Times New Roman" w:hAnsi="Times New Roman"/>
           <w:sz w:val="26"/>
+          <w:rFonts w:ascii="Times New Roman" w:hAnsi="Times New Roman" w:cs="Times New Roman"/>
         </w:rPr>
         <w:t>Sĩ</w:t>
       </w:r>
@@ -378,6 +398,7 @@
         <w:rPr>
           <w:rFonts w:ascii="Times New Roman" w:hAnsi="Times New Roman"/>
           <w:sz w:val="26"/>
+          <w:rFonts w:ascii="Times New Roman" w:hAnsi="Times New Roman" w:cs="Times New Roman"/>
         </w:rPr>
         <w:t xml:space="preserve"> số</w:t>
       </w:r>
@@ -385,6 +406,7 @@
         <w:rPr>
           <w:rFonts w:ascii="Times New Roman" w:hAnsi="Times New Roman"/>
           <w:sz w:val="26"/>
+          <w:rFonts w:ascii="Times New Roman" w:hAnsi="Times New Roman" w:cs="Times New Roman"/>
         </w:rPr>
         <w:t xml:space="preserve"> giáo viên:</w:t>
       </w:r>
@@ -392,6 +414,7 @@
         <w:rPr>
           <w:rFonts w:ascii="Times New Roman" w:hAnsi="Times New Roman"/>
           <w:sz w:val="26"/>
+          <w:rFonts w:ascii="Times New Roman" w:hAnsi="Times New Roman" w:cs="Times New Roman"/>
         </w:rPr>
         <w:t xml:space="preserve"> 1</w:t>
       </w:r>
@@ -404,6 +427,7 @@
         <w:rPr>
           <w:rFonts w:ascii="Times New Roman" w:hAnsi="Times New Roman"/>
           <w:sz w:val="26"/>
+          <w:rFonts w:ascii="Times New Roman" w:hAnsi="Times New Roman" w:cs="Times New Roman"/>
         </w:rPr>
         <w:t>- Trình độ đào tạo: Cao đẳng:…………Đại học:……</w:t>
       </w:r>
@@ -411,6 +435,7 @@
         <w:rPr>
           <w:rFonts w:ascii="Times New Roman" w:hAnsi="Times New Roman"/>
           <w:sz w:val="26"/>
+          <w:rFonts w:ascii="Times New Roman" w:hAnsi="Times New Roman" w:cs="Times New Roman"/>
         </w:rPr>
         <w:t>1</w:t>
       </w:r>
@@ -418,6 +443,7 @@
         <w:rPr>
           <w:rFonts w:ascii="Times New Roman" w:hAnsi="Times New Roman"/>
           <w:sz w:val="26"/>
+          <w:rFonts w:ascii="Times New Roman" w:hAnsi="Times New Roman" w:cs="Times New Roman"/>
         </w:rPr>
         <w:t>……..; Trên Đại học:…………</w:t>
       </w:r>
@@ -430,6 +456,7 @@
         <w:rPr>
           <w:rFonts w:ascii="Times New Roman" w:hAnsi="Times New Roman"/>
           <w:sz w:val="26"/>
+          <w:rFonts w:ascii="Times New Roman" w:hAnsi="Times New Roman" w:cs="Times New Roman"/>
         </w:rPr>
         <w:t>- Mức chuẩn nghề nghiệp: Tốt:……</w:t>
       </w:r>
@@ -437,6 +464,7 @@
         <w:rPr>
           <w:rFonts w:ascii="Times New Roman" w:hAnsi="Times New Roman"/>
           <w:sz w:val="26"/>
+          <w:rFonts w:ascii="Times New Roman" w:hAnsi="Times New Roman" w:cs="Times New Roman"/>
         </w:rPr>
         <w:t>1</w:t>
       </w:r>
@@ -444,6 +472,7 @@
         <w:rPr>
           <w:rFonts w:ascii="Times New Roman" w:hAnsi="Times New Roman"/>
           <w:sz w:val="26"/>
+          <w:rFonts w:ascii="Times New Roman" w:hAnsi="Times New Roman" w:cs="Times New Roman"/>
         </w:rPr>
         <w:t>…….; Khá:………; Đạt:………..;Chưa đạt:……</w:t>
       </w:r>
@@ -461,6 +490,7 @@
           <w:b/>
           <w:bCs/>
           <w:sz w:val="26"/>
+          <w:rFonts w:ascii="Times New Roman" w:hAnsi="Times New Roman" w:cs="Times New Roman"/>
         </w:rPr>
         <w:t>3. Thiết bị dạy học: (</w:t>
       </w:r>
@@ -470,6 +500,7 @@
           <w:i/>
           <w:iCs/>
           <w:sz w:val="26"/>
+          <w:rFonts w:ascii="Times New Roman" w:hAnsi="Times New Roman" w:cs="Times New Roman"/>
         </w:rPr>
         <w:t>Trình bày cụ thể các thiết bị dạy học có thể sử dụng để tổ chức dạy học/môn học/hoạt động giáo dục)</w:t>
       </w:r>
@@ -523,6 +554,7 @@
                 <w:bCs/>
                 <w:sz w:val="26"/>
                 <w:szCs w:val="26"/>
+                <w:rFonts w:ascii="Times New Roman" w:hAnsi="Times New Roman" w:cs="Times New Roman"/>
               </w:rPr>
               <w:t>STT</w:t>
             </w:r>
@@ -550,6 +582,7 @@
                 <w:bCs/>
                 <w:sz w:val="26"/>
                 <w:szCs w:val="26"/>
+                <w:rFonts w:ascii="Times New Roman" w:hAnsi="Times New Roman" w:cs="Times New Roman"/>
               </w:rPr>
               <w:t>Thiết bị dạy học</w:t>
             </w:r>
@@ -577,6 +610,7 @@
                 <w:bCs/>
                 <w:sz w:val="26"/>
                 <w:szCs w:val="26"/>
+                <w:rFonts w:ascii="Times New Roman" w:hAnsi="Times New Roman" w:cs="Times New Roman"/>
               </w:rPr>
               <w:t>Số lượng</w:t>
             </w:r>
@@ -604,6 +638,7 @@
                 <w:bCs/>
                 <w:sz w:val="26"/>
                 <w:szCs w:val="26"/>
+                <w:rFonts w:ascii="Times New Roman" w:hAnsi="Times New Roman" w:cs="Times New Roman"/>
               </w:rPr>
               <w:t>Các bài thí nghiệm/thực hành</w:t>
             </w:r>
@@ -631,6 +666,7 @@
                 <w:bCs/>
                 <w:sz w:val="26"/>
                 <w:szCs w:val="26"/>
+                <w:rFonts w:ascii="Times New Roman" w:hAnsi="Times New Roman" w:cs="Times New Roman"/>
               </w:rPr>
               <w:t>Gihi chú</w:t>
             </w:r>
@@ -658,6 +694,7 @@
                 <w:rFonts w:ascii="Times New Roman" w:eastAsia="Times New Roman" w:hAnsi="Times New Roman" w:cs="Times New Roman"/>
                 <w:sz w:val="26"/>
                 <w:szCs w:val="26"/>
+                <w:rFonts w:ascii="Times New Roman" w:hAnsi="Times New Roman" w:cs="Times New Roman"/>
               </w:rPr>
               <w:t>1</w:t>
             </w:r>
@@ -680,6 +717,7 @@
                 <w:rFonts w:ascii="Times New Roman" w:eastAsia="Times New Roman" w:hAnsi="Times New Roman" w:cs="Times New Roman"/>
                 <w:sz w:val="26"/>
                 <w:szCs w:val="26"/>
+                <w:rFonts w:ascii="Times New Roman" w:hAnsi="Times New Roman" w:cs="Times New Roman"/>
               </w:rPr>
               <w:t>Máy chiếu</w:t>
             </w:r>
@@ -702,6 +740,7 @@
                 <w:rFonts w:ascii="Times New Roman" w:eastAsia="Times New Roman" w:hAnsi="Times New Roman" w:cs="Times New Roman"/>
                 <w:sz w:val="26"/>
                 <w:szCs w:val="26"/>
+                <w:rFonts w:ascii="Times New Roman" w:hAnsi="Times New Roman" w:cs="Times New Roman"/>
               </w:rPr>
               <w:t>1</w:t>
             </w:r>
@@ -757,6 +796,7 @@
                 <w:rFonts w:ascii="Times New Roman" w:eastAsia="Times New Roman" w:hAnsi="Times New Roman" w:cs="Times New Roman"/>
                 <w:sz w:val="26"/>
                 <w:szCs w:val="26"/>
+                <w:rFonts w:ascii="Times New Roman" w:hAnsi="Times New Roman" w:cs="Times New Roman"/>
               </w:rPr>
               <w:t>2</w:t>
             </w:r>
@@ -779,6 +819,7 @@
                 <w:rFonts w:ascii="Times New Roman" w:eastAsia="Times New Roman" w:hAnsi="Times New Roman" w:cs="Times New Roman"/>
                 <w:sz w:val="26"/>
                 <w:szCs w:val="26"/>
+                <w:rFonts w:ascii="Times New Roman" w:hAnsi="Times New Roman" w:cs="Times New Roman"/>
               </w:rPr>
               <w:t>Máy tính</w:t>
             </w:r>
@@ -840,6 +881,7 @@
               <w:rPr>
                 <w:rFonts w:ascii="Times New Roman" w:hAnsi="Times New Roman"/>
                 <w:sz w:val="26"/>
+                <w:rFonts w:ascii="Times New Roman" w:hAnsi="Times New Roman" w:cs="Times New Roman"/>
               </w:rPr>
               <w:t>….</w:t>
             </w:r>
@@ -884,6 +926,7 @@
           <w:b/>
           <w:bCs/>
           <w:sz w:val="26"/>
+          <w:rFonts w:ascii="Times New Roman" w:hAnsi="Times New Roman" w:cs="Times New Roman"/>
         </w:rPr>
         <w:t xml:space="preserve">4. Phòng học bộ môn/phòng thí nghiệm/phòng đa năng/sân chơi, bãi tập </w:t>
       </w:r>
@@ -891,6 +934,7 @@
         <w:rPr>
           <w:rFonts w:ascii="Times New Roman" w:hAnsi="Times New Roman"/>
           <w:sz w:val="26"/>
+          <w:rFonts w:ascii="Times New Roman" w:hAnsi="Times New Roman" w:cs="Times New Roman"/>
         </w:rPr>
         <w:t>(</w:t>
       </w:r>
@@ -900,6 +944,7 @@
           <w:i/>
           <w:iCs/>
           <w:sz w:val="26"/>
+          <w:rFonts w:ascii="Times New Roman" w:hAnsi="Times New Roman" w:cs="Times New Roman"/>
         </w:rPr>
         <w:t>Trinh bày cụ thể các phòng thí nghiệm/phòng bộ môn/phòng đa năng/sân chơi/bãi tập có thể sử dụng để tổ chức dạy học môn học/hoạt động giáo dục)</w:t>
       </w:r>
@@ -953,6 +998,7 @@
                 <w:bCs/>
                 <w:sz w:val="26"/>
                 <w:szCs w:val="26"/>
+                <w:rFonts w:ascii="Times New Roman" w:hAnsi="Times New Roman" w:cs="Times New Roman"/>
               </w:rPr>
               <w:t>STT</w:t>
             </w:r>
@@ -980,6 +1026,7 @@
                 <w:bCs/>
                 <w:sz w:val="26"/>
                 <w:szCs w:val="26"/>
+                <w:rFonts w:ascii="Times New Roman" w:hAnsi="Times New Roman" w:cs="Times New Roman"/>
               </w:rPr>
               <w:t>Tên phòng</w:t>
             </w:r>
@@ -1007,6 +1054,7 @@
                 <w:bCs/>
                 <w:sz w:val="26"/>
                 <w:szCs w:val="26"/>
+                <w:rFonts w:ascii="Times New Roman" w:hAnsi="Times New Roman" w:cs="Times New Roman"/>
               </w:rPr>
               <w:t>Số lượng</w:t>
             </w:r>
@@ -1034,6 +1082,7 @@
                 <w:bCs/>
                 <w:sz w:val="26"/>
                 <w:szCs w:val="26"/>
+                <w:rFonts w:ascii="Times New Roman" w:hAnsi="Times New Roman" w:cs="Times New Roman"/>
               </w:rPr>
               <w:t>Phạm vi và nội dung sử dụng</w:t>
             </w:r>
@@ -1061,6 +1110,7 @@
                 <w:bCs/>
                 <w:sz w:val="26"/>
                 <w:szCs w:val="26"/>
+                <w:rFonts w:ascii="Times New Roman" w:hAnsi="Times New Roman" w:cs="Times New Roman"/>
               </w:rPr>
               <w:t>Gihi chú</w:t>
             </w:r>
@@ -1088,6 +1138,7 @@
                 <w:rFonts w:ascii="Times New Roman" w:eastAsia="Times New Roman" w:hAnsi="Times New Roman" w:cs="Times New Roman"/>
                 <w:sz w:val="26"/>
                 <w:szCs w:val="26"/>
+                <w:rFonts w:ascii="Times New Roman" w:hAnsi="Times New Roman" w:cs="Times New Roman"/>
               </w:rPr>
               <w:t>1</w:t>
             </w:r>
@@ -1110,6 +1161,7 @@
                 <w:rFonts w:ascii="Times New Roman" w:eastAsia="Times New Roman" w:hAnsi="Times New Roman" w:cs="Times New Roman"/>
                 <w:sz w:val="26"/>
                 <w:szCs w:val="26"/>
+                <w:rFonts w:ascii="Times New Roman" w:hAnsi="Times New Roman" w:cs="Times New Roman"/>
               </w:rPr>
               <w:t>Phòng Robotics</w:t>
             </w:r>
@@ -1179,6 +1231,7 @@
                 <w:rFonts w:ascii="Times New Roman" w:eastAsia="Times New Roman" w:hAnsi="Times New Roman" w:cs="Times New Roman"/>
                 <w:sz w:val="26"/>
                 <w:szCs w:val="26"/>
+                <w:rFonts w:ascii="Times New Roman" w:hAnsi="Times New Roman" w:cs="Times New Roman"/>
               </w:rPr>
               <w:t>2</w:t>
             </w:r>
@@ -1254,6 +1307,7 @@
               <w:rPr>
                 <w:rFonts w:ascii="Times New Roman" w:hAnsi="Times New Roman"/>
                 <w:sz w:val="26"/>
+                <w:rFonts w:ascii="Times New Roman" w:hAnsi="Times New Roman" w:cs="Times New Roman"/>
               </w:rPr>
               <w:t>….</w:t>
             </w:r>
@@ -1296,6 +1350,7 @@
         <w:rPr>
           <w:rFonts w:ascii="Times New Roman" w:hAnsi="Times New Roman"/>
           <w:sz w:val="26"/>
+          <w:rFonts w:ascii="Times New Roman" w:hAnsi="Times New Roman" w:cs="Times New Roman"/>
         </w:rPr>
         <w:t xml:space="preserve">II. </w:t>
       </w:r>
@@ -1305,6 +1360,7 @@
           <w:b/>
           <w:bCs/>
           <w:sz w:val="26"/>
+          <w:rFonts w:ascii="Times New Roman" w:hAnsi="Times New Roman" w:cs="Times New Roman"/>
         </w:rPr>
         <w:t>Kế hoạch dạy học</w:t>
       </w:r>
@@ -1320,6 +1376,7 @@
         <w:rPr>
           <w:rFonts w:ascii="Times New Roman" w:hAnsi="Times New Roman"/>
           <w:sz w:val="26"/>
+          <w:rFonts w:ascii="Times New Roman" w:hAnsi="Times New Roman" w:cs="Times New Roman"/>
         </w:rPr>
         <w:lastRenderedPageBreak/>
         <w:t xml:space="preserve">1. </w:t>
@@ -1330,6 +1387,7 @@
           <w:b/>
           <w:bCs/>
           <w:sz w:val="26"/>
+          <w:rFonts w:ascii="Times New Roman" w:hAnsi="Times New Roman" w:cs="Times New Roman"/>
         </w:rPr>
         <w:t>Phân phối chương trình</w:t>
       </w:r>
@@ -1347,6 +1405,7 @@
           <w:b/>
           <w:bCs/>
           <w:sz w:val="26"/>
+          <w:rFonts w:ascii="Times New Roman" w:hAnsi="Times New Roman" w:cs="Times New Roman"/>
         </w:rPr>
         <w:t xml:space="preserve">Môn Tin lớp </w:t>
       </w:r>
@@ -1356,6 +1415,7 @@
           <w:b/>
           <w:bCs/>
           <w:sz w:val="26"/>
+          <w:rFonts w:ascii="Times New Roman" w:hAnsi="Times New Roman" w:cs="Times New Roman"/>
         </w:rPr>
         <w:t>5</w:t>
       </w:r>
@@ -1394,6 +1454,7 @@
               <w:rPr>
                 <w:rFonts w:ascii="Times New Roman" w:hAnsi="Times New Roman"/>
                 <w:sz w:val="26"/>
+                <w:rFonts w:ascii="Times New Roman" w:hAnsi="Times New Roman" w:cs="Times New Roman"/>
               </w:rPr>
             </w:r>
             <w:r>
@@ -1401,6 +1462,7 @@
                 <w:rFonts w:ascii="Times New Roman" w:hAnsi="Times New Roman"/>
                 <w:b/>
                 <w:sz w:val="26"/>
+                <w:rFonts w:ascii="Times New Roman" w:hAnsi="Times New Roman" w:cs="Times New Roman"/>
               </w:rPr>
               <w:t>STT</w:t>
             </w:r>
@@ -1419,6 +1481,7 @@
               <w:rPr>
                 <w:rFonts w:ascii="Times New Roman" w:hAnsi="Times New Roman"/>
                 <w:sz w:val="26"/>
+                <w:rFonts w:ascii="Times New Roman" w:hAnsi="Times New Roman" w:cs="Times New Roman"/>
               </w:rPr>
             </w:r>
             <w:r>
@@ -1426,6 +1489,7 @@
                 <w:rFonts w:ascii="Times New Roman" w:hAnsi="Times New Roman"/>
                 <w:b/>
                 <w:sz w:val="26"/>
+                <w:rFonts w:ascii="Times New Roman" w:hAnsi="Times New Roman" w:cs="Times New Roman"/>
               </w:rPr>
               <w:t>Bài học (1)</w:t>
             </w:r>
@@ -1444,6 +1508,7 @@
               <w:rPr>
                 <w:rFonts w:ascii="Times New Roman" w:hAnsi="Times New Roman"/>
                 <w:sz w:val="26"/>
+                <w:rFonts w:ascii="Times New Roman" w:hAnsi="Times New Roman" w:cs="Times New Roman"/>
               </w:rPr>
             </w:r>
             <w:r>
@@ -1451,6 +1516,7 @@
                 <w:rFonts w:ascii="Times New Roman" w:hAnsi="Times New Roman"/>
                 <w:b/>
                 <w:sz w:val="26"/>
+                <w:rFonts w:ascii="Times New Roman" w:hAnsi="Times New Roman" w:cs="Times New Roman"/>
               </w:rPr>
               <w:t>Số tiết (2)</w:t>
             </w:r>
@@ -1469,6 +1535,7 @@
               <w:rPr>
                 <w:rFonts w:ascii="Times New Roman" w:hAnsi="Times New Roman"/>
                 <w:sz w:val="26"/>
+                <w:rFonts w:ascii="Times New Roman" w:hAnsi="Times New Roman" w:cs="Times New Roman"/>
               </w:rPr>
             </w:r>
             <w:r>
@@ -1476,6 +1543,7 @@
                 <w:rFonts w:ascii="Times New Roman" w:hAnsi="Times New Roman"/>
                 <w:b/>
                 <w:sz w:val="26"/>
+                <w:rFonts w:ascii="Times New Roman" w:hAnsi="Times New Roman" w:cs="Times New Roman"/>
               </w:rPr>
               <w:t>Yêu cầu cần đạt (3)</w:t>
             </w:r>
@@ -1485,99 +1553,75 @@
       <w:tr>
         <w:tc>
           <w:tcPr>
-            <w:tcW w:w="846" w:type="dxa"/>
-          </w:tcPr>
-          <w:p>
-            <w:pPr>
-              <w:spacing w:before="20" w:after="20"/>
-              <w:jc w:val="center"/>
-            </w:pPr>
-            <w:r>
-              <w:rPr>
-                <w:rFonts w:ascii="Times New Roman" w:hAnsi="Times New Roman"/>
-                <w:sz w:val="26"/>
-              </w:rPr>
-            </w:r>
-            <w:r>
-              <w:rPr>
-                <w:rFonts w:ascii="Times New Roman" w:hAnsi="Times New Roman"/>
-                <w:b w:val="0"/>
-                <w:sz w:val="26"/>
-              </w:rPr>
-              <w:t>1</w:t>
-            </w:r>
-          </w:p>
-        </w:tc>
-        <w:tc>
-          <w:tcPr>
-            <w:tcW w:w="3118" w:type="dxa"/>
-          </w:tcPr>
-          <w:p>
-            <w:pPr>
-              <w:spacing w:before="20" w:after="20"/>
-            </w:pPr>
-            <w:r>
-              <w:rPr>
-                <w:rFonts w:ascii="Times New Roman" w:hAnsi="Times New Roman"/>
-                <w:sz w:val="26"/>
-              </w:rPr>
-            </w:r>
-            <w:r>
-              <w:rPr>
-                <w:rFonts w:ascii="Times New Roman" w:hAnsi="Times New Roman"/>
-                <w:b w:val="0"/>
-                <w:sz w:val="26"/>
-              </w:rPr>
-              <w:t>Bài 1. Động cơ là gì?</w:t>
-            </w:r>
-          </w:p>
-        </w:tc>
-        <w:tc>
-          <w:tcPr>
-            <w:tcW w:w="1134" w:type="dxa"/>
-          </w:tcPr>
-          <w:p>
-            <w:pPr>
-              <w:spacing w:before="20" w:after="20"/>
-              <w:jc w:val="center"/>
-            </w:pPr>
-            <w:r>
-              <w:rPr>
-                <w:rFonts w:ascii="Times New Roman" w:hAnsi="Times New Roman"/>
-                <w:sz w:val="26"/>
-              </w:rPr>
-            </w:r>
-            <w:r>
-              <w:rPr>
-                <w:rFonts w:ascii="Times New Roman" w:hAnsi="Times New Roman"/>
-                <w:b w:val="0"/>
-                <w:sz w:val="26"/>
-              </w:rPr>
-              <w:t>1, 2</w:t>
-            </w:r>
-          </w:p>
-        </w:tc>
-        <w:tc>
-          <w:tcPr>
-            <w:tcW w:w="4536" w:type="dxa"/>
-          </w:tcPr>
-          <w:p>
-            <w:pPr>
-              <w:spacing w:before="20" w:after="20"/>
-            </w:pPr>
-            <w:r>
-              <w:rPr>
-                <w:rFonts w:ascii="Times New Roman" w:hAnsi="Times New Roman"/>
-                <w:sz w:val="26"/>
-              </w:rPr>
-            </w:r>
-            <w:r>
-              <w:rPr>
-                <w:rFonts w:ascii="Times New Roman" w:hAnsi="Times New Roman"/>
-                <w:b w:val="0"/>
-                <w:sz w:val="26"/>
-              </w:rPr>
-              <w:t>Tìm hiểu động cơ Dynamixel, chốt đặc biệt; lắp và vận hành robot xe nâng.</w:t>
+            <w:tcW w:type="dxa" w:w="846"/>
+          </w:tcPr>
+          <w:p>
+            <w:pPr>
+              <w:jc w:val="center"/>
+            </w:pPr>
+            <w:r>
+              <w:rPr>
+                <w:rFonts w:ascii="Times New Roman" w:hAnsi="Times New Roman"/>
+                <w:b w:val="0"/>
+                <w:sz w:val="26"/>
+                <w:rFonts w:ascii="Times New Roman" w:hAnsi="Times New Roman" w:cs="Times New Roman"/>
+                <w:rFonts w:ascii="Times New Roman" w:hAnsi="Times New Roman" w:cs="Times New Roman"/>
+              </w:rPr>
+              <w:t>0</w:t>
+            </w:r>
+          </w:p>
+        </w:tc>
+        <w:tc>
+          <w:tcPr>
+            <w:tcW w:type="dxa" w:w="3118"/>
+          </w:tcPr>
+          <w:p>
+            <w:r>
+              <w:rPr>
+                <w:rFonts w:ascii="Times New Roman" w:hAnsi="Times New Roman"/>
+                <w:b w:val="0"/>
+                <w:sz w:val="26"/>
+                <w:rFonts w:ascii="Times New Roman" w:hAnsi="Times New Roman" w:cs="Times New Roman"/>
+                <w:rFonts w:ascii="Times New Roman" w:hAnsi="Times New Roman" w:cs="Times New Roman"/>
+              </w:rPr>
+              <w:t>Tiết 0: Định hướng môn học</w:t>
+            </w:r>
+          </w:p>
+        </w:tc>
+        <w:tc>
+          <w:tcPr>
+            <w:tcW w:type="dxa" w:w="1134"/>
+          </w:tcPr>
+          <w:p>
+            <w:pPr>
+              <w:jc w:val="center"/>
+            </w:pPr>
+            <w:r>
+              <w:rPr>
+                <w:rFonts w:ascii="Times New Roman" w:hAnsi="Times New Roman"/>
+                <w:b w:val="0"/>
+                <w:sz w:val="26"/>
+                <w:rFonts w:ascii="Times New Roman" w:hAnsi="Times New Roman" w:cs="Times New Roman"/>
+                <w:rFonts w:ascii="Times New Roman" w:hAnsi="Times New Roman" w:cs="Times New Roman"/>
+              </w:rPr>
+              <w:t>0</w:t>
+            </w:r>
+          </w:p>
+        </w:tc>
+        <w:tc>
+          <w:tcPr>
+            <w:tcW w:type="dxa" w:w="4536"/>
+          </w:tcPr>
+          <w:p>
+            <w:r>
+              <w:rPr>
+                <w:rFonts w:ascii="Times New Roman" w:hAnsi="Times New Roman"/>
+                <w:b w:val="0"/>
+                <w:sz w:val="26"/>
+                <w:rFonts w:ascii="Times New Roman" w:hAnsi="Times New Roman" w:cs="Times New Roman"/>
+                <w:rFonts w:ascii="Times New Roman" w:hAnsi="Times New Roman" w:cs="Times New Roman"/>
+              </w:rPr>
+              <w:t>Giới thiệu tổng quan môn học Robotics, phương pháp học tập thực hành, quy trình làm việc nhóm, an toàn sử dụng thiết bị và nội quy phòng học bộ môn.</w:t>
             </w:r>
           </w:p>
         </w:tc>
@@ -1596,15 +1640,17 @@
               <w:rPr>
                 <w:rFonts w:ascii="Times New Roman" w:hAnsi="Times New Roman"/>
                 <w:sz w:val="26"/>
-              </w:rPr>
-            </w:r>
-            <w:r>
-              <w:rPr>
-                <w:rFonts w:ascii="Times New Roman" w:hAnsi="Times New Roman"/>
-                <w:b w:val="0"/>
-                <w:sz w:val="26"/>
-              </w:rPr>
-              <w:t>2</w:t>
+                <w:rFonts w:ascii="Times New Roman" w:hAnsi="Times New Roman" w:cs="Times New Roman"/>
+              </w:rPr>
+            </w:r>
+            <w:r>
+              <w:rPr>
+                <w:rFonts w:ascii="Times New Roman" w:hAnsi="Times New Roman"/>
+                <w:b w:val="0"/>
+                <w:sz w:val="26"/>
+                <w:rFonts w:ascii="Times New Roman" w:hAnsi="Times New Roman" w:cs="Times New Roman"/>
+              </w:rPr>
+              <w:t>1</w:t>
             </w:r>
           </w:p>
         </w:tc>
@@ -1620,15 +1666,17 @@
               <w:rPr>
                 <w:rFonts w:ascii="Times New Roman" w:hAnsi="Times New Roman"/>
                 <w:sz w:val="26"/>
-              </w:rPr>
-            </w:r>
-            <w:r>
-              <w:rPr>
-                <w:rFonts w:ascii="Times New Roman" w:hAnsi="Times New Roman"/>
-                <w:b w:val="0"/>
-                <w:sz w:val="26"/>
-              </w:rPr>
-              <w:t>Bài 2. Robot cố định vật</w:t>
+                <w:rFonts w:ascii="Times New Roman" w:hAnsi="Times New Roman" w:cs="Times New Roman"/>
+              </w:rPr>
+            </w:r>
+            <w:r>
+              <w:rPr>
+                <w:rFonts w:ascii="Times New Roman" w:hAnsi="Times New Roman"/>
+                <w:b w:val="0"/>
+                <w:sz w:val="26"/>
+                <w:rFonts w:ascii="Times New Roman" w:hAnsi="Times New Roman" w:cs="Times New Roman"/>
+              </w:rPr>
+              <w:t>Bài 1. Động cơ là gì?</w:t>
             </w:r>
           </w:p>
         </w:tc>
@@ -1645,15 +1693,17 @@
               <w:rPr>
                 <w:rFonts w:ascii="Times New Roman" w:hAnsi="Times New Roman"/>
                 <w:sz w:val="26"/>
-              </w:rPr>
-            </w:r>
-            <w:r>
-              <w:rPr>
-                <w:rFonts w:ascii="Times New Roman" w:hAnsi="Times New Roman"/>
-                <w:b w:val="0"/>
-                <w:sz w:val="26"/>
-              </w:rPr>
-              <w:t>3, 4</w:t>
+                <w:rFonts w:ascii="Times New Roman" w:hAnsi="Times New Roman" w:cs="Times New Roman"/>
+              </w:rPr>
+            </w:r>
+            <w:r>
+              <w:rPr>
+                <w:rFonts w:ascii="Times New Roman" w:hAnsi="Times New Roman"/>
+                <w:b w:val="0"/>
+                <w:sz w:val="26"/>
+                <w:rFonts w:ascii="Times New Roman" w:hAnsi="Times New Roman" w:cs="Times New Roman"/>
+              </w:rPr>
+              <w:t>1, 2</w:t>
             </w:r>
           </w:p>
         </w:tc>
@@ -1669,15 +1719,17 @@
               <w:rPr>
                 <w:rFonts w:ascii="Times New Roman" w:hAnsi="Times New Roman"/>
                 <w:sz w:val="26"/>
-              </w:rPr>
-            </w:r>
-            <w:r>
-              <w:rPr>
-                <w:rFonts w:ascii="Times New Roman" w:hAnsi="Times New Roman"/>
-                <w:b w:val="0"/>
-                <w:sz w:val="26"/>
-              </w:rPr>
-              <w:t>Tìm hiểu dụng cụ cố định đồ vật; thiết kế robot xe gắp và di chuyển vật thể.</w:t>
+                <w:rFonts w:ascii="Times New Roman" w:hAnsi="Times New Roman" w:cs="Times New Roman"/>
+              </w:rPr>
+            </w:r>
+            <w:r>
+              <w:rPr>
+                <w:rFonts w:ascii="Times New Roman" w:hAnsi="Times New Roman"/>
+                <w:b w:val="0"/>
+                <w:sz w:val="26"/>
+                <w:rFonts w:ascii="Times New Roman" w:hAnsi="Times New Roman" w:cs="Times New Roman"/>
+              </w:rPr>
+              <w:t>Tìm hiểu động cơ Dynamixel, chốt đặc biệt; lắp và vận hành robot xe nâng.</w:t>
             </w:r>
           </w:p>
         </w:tc>
@@ -1696,15 +1748,17 @@
               <w:rPr>
                 <w:rFonts w:ascii="Times New Roman" w:hAnsi="Times New Roman"/>
                 <w:sz w:val="26"/>
-              </w:rPr>
-            </w:r>
-            <w:r>
-              <w:rPr>
-                <w:rFonts w:ascii="Times New Roman" w:hAnsi="Times New Roman"/>
-                <w:b w:val="0"/>
-                <w:sz w:val="26"/>
-              </w:rPr>
-              <w:t>3</w:t>
+                <w:rFonts w:ascii="Times New Roman" w:hAnsi="Times New Roman" w:cs="Times New Roman"/>
+              </w:rPr>
+            </w:r>
+            <w:r>
+              <w:rPr>
+                <w:rFonts w:ascii="Times New Roman" w:hAnsi="Times New Roman"/>
+                <w:b w:val="0"/>
+                <w:sz w:val="26"/>
+                <w:rFonts w:ascii="Times New Roman" w:hAnsi="Times New Roman" w:cs="Times New Roman"/>
+              </w:rPr>
+              <w:t>2</w:t>
             </w:r>
           </w:p>
         </w:tc>
@@ -1720,15 +1774,17 @@
               <w:rPr>
                 <w:rFonts w:ascii="Times New Roman" w:hAnsi="Times New Roman"/>
                 <w:sz w:val="26"/>
-              </w:rPr>
-            </w:r>
-            <w:r>
-              <w:rPr>
-                <w:rFonts w:ascii="Times New Roman" w:hAnsi="Times New Roman"/>
-                <w:b w:val="0"/>
-                <w:sz w:val="26"/>
-              </w:rPr>
-              <w:t>Bài 3. Robot nhận biết âm thanh</w:t>
+                <w:rFonts w:ascii="Times New Roman" w:hAnsi="Times New Roman" w:cs="Times New Roman"/>
+              </w:rPr>
+            </w:r>
+            <w:r>
+              <w:rPr>
+                <w:rFonts w:ascii="Times New Roman" w:hAnsi="Times New Roman"/>
+                <w:b w:val="0"/>
+                <w:sz w:val="26"/>
+                <w:rFonts w:ascii="Times New Roman" w:hAnsi="Times New Roman" w:cs="Times New Roman"/>
+              </w:rPr>
+              <w:t>Bài 2. Robot cố định vật</w:t>
             </w:r>
           </w:p>
         </w:tc>
@@ -1745,15 +1801,17 @@
               <w:rPr>
                 <w:rFonts w:ascii="Times New Roman" w:hAnsi="Times New Roman"/>
                 <w:sz w:val="26"/>
-              </w:rPr>
-            </w:r>
-            <w:r>
-              <w:rPr>
-                <w:rFonts w:ascii="Times New Roman" w:hAnsi="Times New Roman"/>
-                <w:b w:val="0"/>
-                <w:sz w:val="26"/>
-              </w:rPr>
-              <w:t>5, 6</w:t>
+                <w:rFonts w:ascii="Times New Roman" w:hAnsi="Times New Roman" w:cs="Times New Roman"/>
+              </w:rPr>
+            </w:r>
+            <w:r>
+              <w:rPr>
+                <w:rFonts w:ascii="Times New Roman" w:hAnsi="Times New Roman"/>
+                <w:b w:val="0"/>
+                <w:sz w:val="26"/>
+                <w:rFonts w:ascii="Times New Roman" w:hAnsi="Times New Roman" w:cs="Times New Roman"/>
+              </w:rPr>
+              <w:t>3, 4</w:t>
             </w:r>
           </w:p>
         </w:tc>
@@ -1769,15 +1827,17 @@
               <w:rPr>
                 <w:rFonts w:ascii="Times New Roman" w:hAnsi="Times New Roman"/>
                 <w:sz w:val="26"/>
-              </w:rPr>
-            </w:r>
-            <w:r>
-              <w:rPr>
-                <w:rFonts w:ascii="Times New Roman" w:hAnsi="Times New Roman"/>
-                <w:b w:val="0"/>
-                <w:sz w:val="26"/>
-              </w:rPr>
-              <w:t>Tìm hiểu cảm biến âm thanh; lắp robot phản ứng với tiếng vỗ tay.</w:t>
+                <w:rFonts w:ascii="Times New Roman" w:hAnsi="Times New Roman" w:cs="Times New Roman"/>
+              </w:rPr>
+            </w:r>
+            <w:r>
+              <w:rPr>
+                <w:rFonts w:ascii="Times New Roman" w:hAnsi="Times New Roman"/>
+                <w:b w:val="0"/>
+                <w:sz w:val="26"/>
+                <w:rFonts w:ascii="Times New Roman" w:hAnsi="Times New Roman" w:cs="Times New Roman"/>
+              </w:rPr>
+              <w:t>Tìm hiểu dụng cụ cố định đồ vật; thiết kế robot xe gắp và di chuyển vật thể.</w:t>
             </w:r>
           </w:p>
         </w:tc>
@@ -1796,15 +1856,17 @@
               <w:rPr>
                 <w:rFonts w:ascii="Times New Roman" w:hAnsi="Times New Roman"/>
                 <w:sz w:val="26"/>
-              </w:rPr>
-            </w:r>
-            <w:r>
-              <w:rPr>
-                <w:rFonts w:ascii="Times New Roman" w:hAnsi="Times New Roman"/>
-                <w:b w:val="0"/>
-                <w:sz w:val="26"/>
-              </w:rPr>
-              <w:t>4</w:t>
+                <w:rFonts w:ascii="Times New Roman" w:hAnsi="Times New Roman" w:cs="Times New Roman"/>
+              </w:rPr>
+            </w:r>
+            <w:r>
+              <w:rPr>
+                <w:rFonts w:ascii="Times New Roman" w:hAnsi="Times New Roman"/>
+                <w:b w:val="0"/>
+                <w:sz w:val="26"/>
+                <w:rFonts w:ascii="Times New Roman" w:hAnsi="Times New Roman" w:cs="Times New Roman"/>
+              </w:rPr>
+              <w:t>3</w:t>
             </w:r>
           </w:p>
         </w:tc>
@@ -1820,15 +1882,17 @@
               <w:rPr>
                 <w:rFonts w:ascii="Times New Roman" w:hAnsi="Times New Roman"/>
                 <w:sz w:val="26"/>
-              </w:rPr>
-            </w:r>
-            <w:r>
-              <w:rPr>
-                <w:rFonts w:ascii="Times New Roman" w:hAnsi="Times New Roman"/>
-                <w:b w:val="0"/>
-                <w:sz w:val="26"/>
-              </w:rPr>
-              <w:t>Bài 4. Bộ điều khiển từ xa</w:t>
+                <w:rFonts w:ascii="Times New Roman" w:hAnsi="Times New Roman" w:cs="Times New Roman"/>
+              </w:rPr>
+            </w:r>
+            <w:r>
+              <w:rPr>
+                <w:rFonts w:ascii="Times New Roman" w:hAnsi="Times New Roman"/>
+                <w:b w:val="0"/>
+                <w:sz w:val="26"/>
+                <w:rFonts w:ascii="Times New Roman" w:hAnsi="Times New Roman" w:cs="Times New Roman"/>
+              </w:rPr>
+              <w:t>Bài 3. Robot nhận biết âm thanh</w:t>
             </w:r>
           </w:p>
         </w:tc>
@@ -1845,15 +1909,17 @@
               <w:rPr>
                 <w:rFonts w:ascii="Times New Roman" w:hAnsi="Times New Roman"/>
                 <w:sz w:val="26"/>
-              </w:rPr>
-            </w:r>
-            <w:r>
-              <w:rPr>
-                <w:rFonts w:ascii="Times New Roman" w:hAnsi="Times New Roman"/>
-                <w:b w:val="0"/>
-                <w:sz w:val="26"/>
-              </w:rPr>
-              <w:t>7, 8</w:t>
+                <w:rFonts w:ascii="Times New Roman" w:hAnsi="Times New Roman" w:cs="Times New Roman"/>
+              </w:rPr>
+            </w:r>
+            <w:r>
+              <w:rPr>
+                <w:rFonts w:ascii="Times New Roman" w:hAnsi="Times New Roman"/>
+                <w:b w:val="0"/>
+                <w:sz w:val="26"/>
+                <w:rFonts w:ascii="Times New Roman" w:hAnsi="Times New Roman" w:cs="Times New Roman"/>
+              </w:rPr>
+              <w:t>5, 6</w:t>
             </w:r>
           </w:p>
         </w:tc>
@@ -1869,15 +1935,17 @@
               <w:rPr>
                 <w:rFonts w:ascii="Times New Roman" w:hAnsi="Times New Roman"/>
                 <w:sz w:val="26"/>
-              </w:rPr>
-            </w:r>
-            <w:r>
-              <w:rPr>
-                <w:rFonts w:ascii="Times New Roman" w:hAnsi="Times New Roman"/>
-                <w:b w:val="0"/>
-                <w:sz w:val="26"/>
-              </w:rPr>
-              <w:t>Tìm hiểu chức năng bộ điều khiển; điều khiển robot pháo bắn mục tiêu.</w:t>
+                <w:rFonts w:ascii="Times New Roman" w:hAnsi="Times New Roman" w:cs="Times New Roman"/>
+              </w:rPr>
+            </w:r>
+            <w:r>
+              <w:rPr>
+                <w:rFonts w:ascii="Times New Roman" w:hAnsi="Times New Roman"/>
+                <w:b w:val="0"/>
+                <w:sz w:val="26"/>
+                <w:rFonts w:ascii="Times New Roman" w:hAnsi="Times New Roman" w:cs="Times New Roman"/>
+              </w:rPr>
+              <w:t>Tìm hiểu cảm biến âm thanh; lắp robot phản ứng với tiếng vỗ tay.</w:t>
             </w:r>
           </w:p>
         </w:tc>
@@ -1896,15 +1964,17 @@
               <w:rPr>
                 <w:rFonts w:ascii="Times New Roman" w:hAnsi="Times New Roman"/>
                 <w:sz w:val="26"/>
-              </w:rPr>
-            </w:r>
-            <w:r>
-              <w:rPr>
-                <w:rFonts w:ascii="Times New Roman" w:hAnsi="Times New Roman"/>
-                <w:b/>
-                <w:sz w:val="26"/>
-              </w:rPr>
-              <w:t>5</w:t>
+                <w:rFonts w:ascii="Times New Roman" w:hAnsi="Times New Roman" w:cs="Times New Roman"/>
+              </w:rPr>
+            </w:r>
+            <w:r>
+              <w:rPr>
+                <w:rFonts w:ascii="Times New Roman" w:hAnsi="Times New Roman"/>
+                <w:b w:val="0"/>
+                <w:sz w:val="26"/>
+                <w:rFonts w:ascii="Times New Roman" w:hAnsi="Times New Roman" w:cs="Times New Roman"/>
+              </w:rPr>
+              <w:t>4</w:t>
             </w:r>
           </w:p>
         </w:tc>
@@ -1920,15 +1990,17 @@
               <w:rPr>
                 <w:rFonts w:ascii="Times New Roman" w:hAnsi="Times New Roman"/>
                 <w:sz w:val="26"/>
-              </w:rPr>
-            </w:r>
-            <w:r>
-              <w:rPr>
-                <w:rFonts w:ascii="Times New Roman" w:hAnsi="Times New Roman"/>
-                <w:b/>
-                <w:sz w:val="26"/>
-              </w:rPr>
-              <w:t>Ôn tập Đánh giá định kỳ 1</w:t>
+                <w:rFonts w:ascii="Times New Roman" w:hAnsi="Times New Roman" w:cs="Times New Roman"/>
+              </w:rPr>
+            </w:r>
+            <w:r>
+              <w:rPr>
+                <w:rFonts w:ascii="Times New Roman" w:hAnsi="Times New Roman"/>
+                <w:b w:val="0"/>
+                <w:sz w:val="26"/>
+                <w:rFonts w:ascii="Times New Roman" w:hAnsi="Times New Roman" w:cs="Times New Roman"/>
+              </w:rPr>
+              <w:t>Bài 4. Bộ điều khiển từ xa</w:t>
             </w:r>
           </w:p>
         </w:tc>
@@ -1945,15 +2017,17 @@
               <w:rPr>
                 <w:rFonts w:ascii="Times New Roman" w:hAnsi="Times New Roman"/>
                 <w:sz w:val="26"/>
-              </w:rPr>
-            </w:r>
-            <w:r>
-              <w:rPr>
-                <w:rFonts w:ascii="Times New Roman" w:hAnsi="Times New Roman"/>
-                <w:b/>
-                <w:sz w:val="26"/>
-              </w:rPr>
-              <w:t>9</w:t>
+                <w:rFonts w:ascii="Times New Roman" w:hAnsi="Times New Roman" w:cs="Times New Roman"/>
+              </w:rPr>
+            </w:r>
+            <w:r>
+              <w:rPr>
+                <w:rFonts w:ascii="Times New Roman" w:hAnsi="Times New Roman"/>
+                <w:b w:val="0"/>
+                <w:sz w:val="26"/>
+                <w:rFonts w:ascii="Times New Roman" w:hAnsi="Times New Roman" w:cs="Times New Roman"/>
+              </w:rPr>
+              <w:t>7, 8</w:t>
             </w:r>
           </w:p>
         </w:tc>
@@ -1969,15 +2043,17 @@
               <w:rPr>
                 <w:rFonts w:ascii="Times New Roman" w:hAnsi="Times New Roman"/>
                 <w:sz w:val="26"/>
-              </w:rPr>
-            </w:r>
-            <w:r>
-              <w:rPr>
-                <w:rFonts w:ascii="Times New Roman" w:hAnsi="Times New Roman"/>
-                <w:b w:val="0"/>
-                <w:sz w:val="26"/>
-              </w:rPr>
-              <w:t>Hệ thống hóa kiến thức chuẩn bị Đánh giá định kỳ 1.</w:t>
+                <w:rFonts w:ascii="Times New Roman" w:hAnsi="Times New Roman" w:cs="Times New Roman"/>
+              </w:rPr>
+            </w:r>
+            <w:r>
+              <w:rPr>
+                <w:rFonts w:ascii="Times New Roman" w:hAnsi="Times New Roman"/>
+                <w:b w:val="0"/>
+                <w:sz w:val="26"/>
+                <w:rFonts w:ascii="Times New Roman" w:hAnsi="Times New Roman" w:cs="Times New Roman"/>
+              </w:rPr>
+              <w:t>Tìm hiểu chức năng bộ điều khiển; điều khiển robot pháo bắn mục tiêu.</w:t>
             </w:r>
           </w:p>
         </w:tc>
@@ -1996,6 +2072,7 @@
               <w:rPr>
                 <w:rFonts w:ascii="Times New Roman" w:hAnsi="Times New Roman"/>
                 <w:sz w:val="26"/>
+                <w:rFonts w:ascii="Times New Roman" w:hAnsi="Times New Roman" w:cs="Times New Roman"/>
               </w:rPr>
             </w:r>
             <w:r>
@@ -2003,8 +2080,9 @@
                 <w:rFonts w:ascii="Times New Roman" w:hAnsi="Times New Roman"/>
                 <w:b/>
                 <w:sz w:val="26"/>
-              </w:rPr>
-              <w:t>6</w:t>
+                <w:rFonts w:ascii="Times New Roman" w:hAnsi="Times New Roman" w:cs="Times New Roman"/>
+              </w:rPr>
+              <w:t>5</w:t>
             </w:r>
           </w:p>
         </w:tc>
@@ -2020,6 +2098,7 @@
               <w:rPr>
                 <w:rFonts w:ascii="Times New Roman" w:hAnsi="Times New Roman"/>
                 <w:sz w:val="26"/>
+                <w:rFonts w:ascii="Times New Roman" w:hAnsi="Times New Roman" w:cs="Times New Roman"/>
               </w:rPr>
             </w:r>
             <w:r>
@@ -2027,8 +2106,9 @@
                 <w:rFonts w:ascii="Times New Roman" w:hAnsi="Times New Roman"/>
                 <w:b/>
                 <w:sz w:val="26"/>
-              </w:rPr>
-              <w:t>Đánh giá định kỳ 1</w:t>
+                <w:rFonts w:ascii="Times New Roman" w:hAnsi="Times New Roman" w:cs="Times New Roman"/>
+              </w:rPr>
+              <w:t>Ôn tập Đánh giá định kỳ 1</w:t>
             </w:r>
           </w:p>
         </w:tc>
@@ -2045,6 +2125,7 @@
               <w:rPr>
                 <w:rFonts w:ascii="Times New Roman" w:hAnsi="Times New Roman"/>
                 <w:sz w:val="26"/>
+                <w:rFonts w:ascii="Times New Roman" w:hAnsi="Times New Roman" w:cs="Times New Roman"/>
               </w:rPr>
             </w:r>
             <w:r>
@@ -2052,8 +2133,9 @@
                 <w:rFonts w:ascii="Times New Roman" w:hAnsi="Times New Roman"/>
                 <w:b/>
                 <w:sz w:val="26"/>
-              </w:rPr>
-              <w:t>10</w:t>
+                <w:rFonts w:ascii="Times New Roman" w:hAnsi="Times New Roman" w:cs="Times New Roman"/>
+              </w:rPr>
+              <w:t>9</w:t>
             </w:r>
           </w:p>
         </w:tc>
@@ -2069,15 +2151,17 @@
               <w:rPr>
                 <w:rFonts w:ascii="Times New Roman" w:hAnsi="Times New Roman"/>
                 <w:sz w:val="26"/>
-              </w:rPr>
-            </w:r>
-            <w:r>
-              <w:rPr>
-                <w:rFonts w:ascii="Times New Roman" w:hAnsi="Times New Roman"/>
-                <w:b w:val="0"/>
-                <w:sz w:val="26"/>
-              </w:rPr>
-              <w:t>Kiểm tra đánh giá kết quả học tập thực hành Robotics.</w:t>
+                <w:rFonts w:ascii="Times New Roman" w:hAnsi="Times New Roman" w:cs="Times New Roman"/>
+              </w:rPr>
+            </w:r>
+            <w:r>
+              <w:rPr>
+                <w:rFonts w:ascii="Times New Roman" w:hAnsi="Times New Roman"/>
+                <w:b w:val="0"/>
+                <w:sz w:val="26"/>
+                <w:rFonts w:ascii="Times New Roman" w:hAnsi="Times New Roman" w:cs="Times New Roman"/>
+              </w:rPr>
+              <w:t>Hệ thống hóa kiến thức chuẩn bị Đánh giá định kỳ 1.</w:t>
             </w:r>
           </w:p>
         </w:tc>
@@ -2096,15 +2180,17 @@
               <w:rPr>
                 <w:rFonts w:ascii="Times New Roman" w:hAnsi="Times New Roman"/>
                 <w:sz w:val="26"/>
-              </w:rPr>
-            </w:r>
-            <w:r>
-              <w:rPr>
-                <w:rFonts w:ascii="Times New Roman" w:hAnsi="Times New Roman"/>
-                <w:b w:val="0"/>
-                <w:sz w:val="26"/>
-              </w:rPr>
-              <w:t>7</w:t>
+                <w:rFonts w:ascii="Times New Roman" w:hAnsi="Times New Roman" w:cs="Times New Roman"/>
+              </w:rPr>
+            </w:r>
+            <w:r>
+              <w:rPr>
+                <w:rFonts w:ascii="Times New Roman" w:hAnsi="Times New Roman"/>
+                <w:b/>
+                <w:sz w:val="26"/>
+                <w:rFonts w:ascii="Times New Roman" w:hAnsi="Times New Roman" w:cs="Times New Roman"/>
+              </w:rPr>
+              <w:t>6</w:t>
             </w:r>
           </w:p>
         </w:tc>
@@ -2120,15 +2206,17 @@
               <w:rPr>
                 <w:rFonts w:ascii="Times New Roman" w:hAnsi="Times New Roman"/>
                 <w:sz w:val="26"/>
-              </w:rPr>
-            </w:r>
-            <w:r>
-              <w:rPr>
-                <w:rFonts w:ascii="Times New Roman" w:hAnsi="Times New Roman"/>
-                <w:b w:val="0"/>
-                <w:sz w:val="26"/>
-              </w:rPr>
-              <w:t>Bài 5. Động cơ Dynamixel hoạt động thế nào?</w:t>
+                <w:rFonts w:ascii="Times New Roman" w:hAnsi="Times New Roman" w:cs="Times New Roman"/>
+              </w:rPr>
+            </w:r>
+            <w:r>
+              <w:rPr>
+                <w:rFonts w:ascii="Times New Roman" w:hAnsi="Times New Roman"/>
+                <w:b/>
+                <w:sz w:val="26"/>
+                <w:rFonts w:ascii="Times New Roman" w:hAnsi="Times New Roman" w:cs="Times New Roman"/>
+              </w:rPr>
+              <w:t>Đánh giá định kỳ 1</w:t>
             </w:r>
           </w:p>
         </w:tc>
@@ -2145,15 +2233,17 @@
               <w:rPr>
                 <w:rFonts w:ascii="Times New Roman" w:hAnsi="Times New Roman"/>
                 <w:sz w:val="26"/>
-              </w:rPr>
-            </w:r>
-            <w:r>
-              <w:rPr>
-                <w:rFonts w:ascii="Times New Roman" w:hAnsi="Times New Roman"/>
-                <w:b w:val="0"/>
-                <w:sz w:val="26"/>
-              </w:rPr>
-              <w:t>11, 12</w:t>
+                <w:rFonts w:ascii="Times New Roman" w:hAnsi="Times New Roman" w:cs="Times New Roman"/>
+              </w:rPr>
+            </w:r>
+            <w:r>
+              <w:rPr>
+                <w:rFonts w:ascii="Times New Roman" w:hAnsi="Times New Roman"/>
+                <w:b/>
+                <w:sz w:val="26"/>
+                <w:rFonts w:ascii="Times New Roman" w:hAnsi="Times New Roman" w:cs="Times New Roman"/>
+              </w:rPr>
+              <w:t>10</w:t>
             </w:r>
           </w:p>
         </w:tc>
@@ -2169,15 +2259,17 @@
               <w:rPr>
                 <w:rFonts w:ascii="Times New Roman" w:hAnsi="Times New Roman"/>
                 <w:sz w:val="26"/>
-              </w:rPr>
-            </w:r>
-            <w:r>
-              <w:rPr>
-                <w:rFonts w:ascii="Times New Roman" w:hAnsi="Times New Roman"/>
-                <w:b w:val="0"/>
-                <w:sz w:val="26"/>
-              </w:rPr>
-              <w:t>Tìm hiểu cách hoạt động của động cơ servo Dynamixel; lắp robot khuếch đại chuyển động.</w:t>
+                <w:rFonts w:ascii="Times New Roman" w:hAnsi="Times New Roman" w:cs="Times New Roman"/>
+              </w:rPr>
+            </w:r>
+            <w:r>
+              <w:rPr>
+                <w:rFonts w:ascii="Times New Roman" w:hAnsi="Times New Roman"/>
+                <w:b w:val="0"/>
+                <w:sz w:val="26"/>
+                <w:rFonts w:ascii="Times New Roman" w:hAnsi="Times New Roman" w:cs="Times New Roman"/>
+              </w:rPr>
+              <w:t>Kiểm tra đánh giá kết quả học tập thực hành Robotics.</w:t>
             </w:r>
           </w:p>
         </w:tc>
@@ -2196,15 +2288,17 @@
               <w:rPr>
                 <w:rFonts w:ascii="Times New Roman" w:hAnsi="Times New Roman"/>
                 <w:sz w:val="26"/>
-              </w:rPr>
-            </w:r>
-            <w:r>
-              <w:rPr>
-                <w:rFonts w:ascii="Times New Roman" w:hAnsi="Times New Roman"/>
-                <w:b w:val="0"/>
-                <w:sz w:val="26"/>
-              </w:rPr>
-              <w:t>8</w:t>
+                <w:rFonts w:ascii="Times New Roman" w:hAnsi="Times New Roman" w:cs="Times New Roman"/>
+              </w:rPr>
+            </w:r>
+            <w:r>
+              <w:rPr>
+                <w:rFonts w:ascii="Times New Roman" w:hAnsi="Times New Roman"/>
+                <w:b w:val="0"/>
+                <w:sz w:val="26"/>
+                <w:rFonts w:ascii="Times New Roman" w:hAnsi="Times New Roman" w:cs="Times New Roman"/>
+              </w:rPr>
+              <w:t>7</w:t>
             </w:r>
           </w:p>
         </w:tc>
@@ -2220,15 +2314,17 @@
               <w:rPr>
                 <w:rFonts w:ascii="Times New Roman" w:hAnsi="Times New Roman"/>
                 <w:sz w:val="26"/>
-              </w:rPr>
-            </w:r>
-            <w:r>
-              <w:rPr>
-                <w:rFonts w:ascii="Times New Roman" w:hAnsi="Times New Roman"/>
-                <w:b w:val="0"/>
-                <w:sz w:val="26"/>
-              </w:rPr>
-              <w:t>Bài 6. Phương tiện giao thông qua các thời đại</w:t>
+                <w:rFonts w:ascii="Times New Roman" w:hAnsi="Times New Roman" w:cs="Times New Roman"/>
+              </w:rPr>
+            </w:r>
+            <w:r>
+              <w:rPr>
+                <w:rFonts w:ascii="Times New Roman" w:hAnsi="Times New Roman"/>
+                <w:b w:val="0"/>
+                <w:sz w:val="26"/>
+                <w:rFonts w:ascii="Times New Roman" w:hAnsi="Times New Roman" w:cs="Times New Roman"/>
+              </w:rPr>
+              <w:t>Bài 5. Động cơ Dynamixel hoạt động thế nào?</w:t>
             </w:r>
           </w:p>
         </w:tc>
@@ -2245,15 +2341,17 @@
               <w:rPr>
                 <w:rFonts w:ascii="Times New Roman" w:hAnsi="Times New Roman"/>
                 <w:sz w:val="26"/>
-              </w:rPr>
-            </w:r>
-            <w:r>
-              <w:rPr>
-                <w:rFonts w:ascii="Times New Roman" w:hAnsi="Times New Roman"/>
-                <w:b w:val="0"/>
-                <w:sz w:val="26"/>
-              </w:rPr>
-              <w:t>13, 14</w:t>
+                <w:rFonts w:ascii="Times New Roman" w:hAnsi="Times New Roman" w:cs="Times New Roman"/>
+              </w:rPr>
+            </w:r>
+            <w:r>
+              <w:rPr>
+                <w:rFonts w:ascii="Times New Roman" w:hAnsi="Times New Roman"/>
+                <w:b w:val="0"/>
+                <w:sz w:val="26"/>
+                <w:rFonts w:ascii="Times New Roman" w:hAnsi="Times New Roman" w:cs="Times New Roman"/>
+              </w:rPr>
+              <w:t>11, 12</w:t>
             </w:r>
           </w:p>
         </w:tc>
@@ -2269,15 +2367,17 @@
               <w:rPr>
                 <w:rFonts w:ascii="Times New Roman" w:hAnsi="Times New Roman"/>
                 <w:sz w:val="26"/>
-              </w:rPr>
-            </w:r>
-            <w:r>
-              <w:rPr>
-                <w:rFonts w:ascii="Times New Roman" w:hAnsi="Times New Roman"/>
-                <w:b w:val="0"/>
-                <w:sz w:val="26"/>
-              </w:rPr>
-              <w:t>Tìm hiểu cơ cấu chuyển động lặp; chế tạo robot đua ngựa thi đấu.</w:t>
+                <w:rFonts w:ascii="Times New Roman" w:hAnsi="Times New Roman" w:cs="Times New Roman"/>
+              </w:rPr>
+            </w:r>
+            <w:r>
+              <w:rPr>
+                <w:rFonts w:ascii="Times New Roman" w:hAnsi="Times New Roman"/>
+                <w:b w:val="0"/>
+                <w:sz w:val="26"/>
+                <w:rFonts w:ascii="Times New Roman" w:hAnsi="Times New Roman" w:cs="Times New Roman"/>
+              </w:rPr>
+              <w:t>Tìm hiểu cách hoạt động của động cơ servo Dynamixel; lắp robot khuếch đại chuyển động.</w:t>
             </w:r>
           </w:p>
         </w:tc>
@@ -2296,15 +2396,17 @@
               <w:rPr>
                 <w:rFonts w:ascii="Times New Roman" w:hAnsi="Times New Roman"/>
                 <w:sz w:val="26"/>
-              </w:rPr>
-            </w:r>
-            <w:r>
-              <w:rPr>
-                <w:rFonts w:ascii="Times New Roman" w:hAnsi="Times New Roman"/>
-                <w:b w:val="0"/>
-                <w:sz w:val="26"/>
-              </w:rPr>
-              <w:t>9</w:t>
+                <w:rFonts w:ascii="Times New Roman" w:hAnsi="Times New Roman" w:cs="Times New Roman"/>
+              </w:rPr>
+            </w:r>
+            <w:r>
+              <w:rPr>
+                <w:rFonts w:ascii="Times New Roman" w:hAnsi="Times New Roman"/>
+                <w:b w:val="0"/>
+                <w:sz w:val="26"/>
+                <w:rFonts w:ascii="Times New Roman" w:hAnsi="Times New Roman" w:cs="Times New Roman"/>
+              </w:rPr>
+              <w:t>8</w:t>
             </w:r>
           </w:p>
         </w:tc>
@@ -2320,15 +2422,17 @@
               <w:rPr>
                 <w:rFonts w:ascii="Times New Roman" w:hAnsi="Times New Roman"/>
                 <w:sz w:val="26"/>
-              </w:rPr>
-            </w:r>
-            <w:r>
-              <w:rPr>
-                <w:rFonts w:ascii="Times New Roman" w:hAnsi="Times New Roman"/>
-                <w:b w:val="0"/>
-                <w:sz w:val="26"/>
-              </w:rPr>
-              <w:t>Bài 7. Cơ chế tăng giảm chiều dài tự động</w:t>
+                <w:rFonts w:ascii="Times New Roman" w:hAnsi="Times New Roman" w:cs="Times New Roman"/>
+              </w:rPr>
+            </w:r>
+            <w:r>
+              <w:rPr>
+                <w:rFonts w:ascii="Times New Roman" w:hAnsi="Times New Roman"/>
+                <w:b w:val="0"/>
+                <w:sz w:val="26"/>
+                <w:rFonts w:ascii="Times New Roman" w:hAnsi="Times New Roman" w:cs="Times New Roman"/>
+              </w:rPr>
+              <w:t>Bài 6. Phương tiện giao thông qua các thời đại</w:t>
             </w:r>
           </w:p>
         </w:tc>
@@ -2345,15 +2449,17 @@
               <w:rPr>
                 <w:rFonts w:ascii="Times New Roman" w:hAnsi="Times New Roman"/>
                 <w:sz w:val="26"/>
-              </w:rPr>
-            </w:r>
-            <w:r>
-              <w:rPr>
-                <w:rFonts w:ascii="Times New Roman" w:hAnsi="Times New Roman"/>
-                <w:b w:val="0"/>
-                <w:sz w:val="26"/>
-              </w:rPr>
-              <w:t>15, 16</w:t>
+                <w:rFonts w:ascii="Times New Roman" w:hAnsi="Times New Roman" w:cs="Times New Roman"/>
+              </w:rPr>
+            </w:r>
+            <w:r>
+              <w:rPr>
+                <w:rFonts w:ascii="Times New Roman" w:hAnsi="Times New Roman"/>
+                <w:b w:val="0"/>
+                <w:sz w:val="26"/>
+                <w:rFonts w:ascii="Times New Roman" w:hAnsi="Times New Roman" w:cs="Times New Roman"/>
+              </w:rPr>
+              <w:t>13, 14</w:t>
             </w:r>
           </w:p>
         </w:tc>
@@ -2369,15 +2475,17 @@
               <w:rPr>
                 <w:rFonts w:ascii="Times New Roman" w:hAnsi="Times New Roman"/>
                 <w:sz w:val="26"/>
-              </w:rPr>
-            </w:r>
-            <w:r>
-              <w:rPr>
-                <w:rFonts w:ascii="Times New Roman" w:hAnsi="Times New Roman"/>
-                <w:b w:val="0"/>
-                <w:sz w:val="26"/>
-              </w:rPr>
-              <w:t>Tìm hiểu cơ cấu kẹp linh hoạt và cánh tay robot; lắp robot gỡ bom/gắp vật xa.</w:t>
+                <w:rFonts w:ascii="Times New Roman" w:hAnsi="Times New Roman" w:cs="Times New Roman"/>
+              </w:rPr>
+            </w:r>
+            <w:r>
+              <w:rPr>
+                <w:rFonts w:ascii="Times New Roman" w:hAnsi="Times New Roman"/>
+                <w:b w:val="0"/>
+                <w:sz w:val="26"/>
+                <w:rFonts w:ascii="Times New Roman" w:hAnsi="Times New Roman" w:cs="Times New Roman"/>
+              </w:rPr>
+              <w:t>Tìm hiểu cơ cấu chuyển động lặp; chế tạo robot đua ngựa thi đấu.</w:t>
             </w:r>
           </w:p>
         </w:tc>
@@ -2396,15 +2504,17 @@
               <w:rPr>
                 <w:rFonts w:ascii="Times New Roman" w:hAnsi="Times New Roman"/>
                 <w:sz w:val="26"/>
-              </w:rPr>
-            </w:r>
-            <w:r>
-              <w:rPr>
-                <w:rFonts w:ascii="Times New Roman" w:hAnsi="Times New Roman"/>
-                <w:b w:val="0"/>
-                <w:sz w:val="26"/>
-              </w:rPr>
-              <w:t>10</w:t>
+                <w:rFonts w:ascii="Times New Roman" w:hAnsi="Times New Roman" w:cs="Times New Roman"/>
+              </w:rPr>
+            </w:r>
+            <w:r>
+              <w:rPr>
+                <w:rFonts w:ascii="Times New Roman" w:hAnsi="Times New Roman"/>
+                <w:b w:val="0"/>
+                <w:sz w:val="26"/>
+                <w:rFonts w:ascii="Times New Roman" w:hAnsi="Times New Roman" w:cs="Times New Roman"/>
+              </w:rPr>
+              <w:t>9</w:t>
             </w:r>
           </w:p>
         </w:tc>
@@ -2420,15 +2530,17 @@
               <w:rPr>
                 <w:rFonts w:ascii="Times New Roman" w:hAnsi="Times New Roman"/>
                 <w:sz w:val="26"/>
-              </w:rPr>
-            </w:r>
-            <w:r>
-              <w:rPr>
-                <w:rFonts w:ascii="Times New Roman" w:hAnsi="Times New Roman"/>
-                <w:b w:val="0"/>
-                <w:sz w:val="26"/>
-              </w:rPr>
-              <w:t>Bài 8. Robot nhận biết vật thể bằng cách nào?</w:t>
+                <w:rFonts w:ascii="Times New Roman" w:hAnsi="Times New Roman" w:cs="Times New Roman"/>
+              </w:rPr>
+            </w:r>
+            <w:r>
+              <w:rPr>
+                <w:rFonts w:ascii="Times New Roman" w:hAnsi="Times New Roman"/>
+                <w:b w:val="0"/>
+                <w:sz w:val="26"/>
+                <w:rFonts w:ascii="Times New Roman" w:hAnsi="Times New Roman" w:cs="Times New Roman"/>
+              </w:rPr>
+              <w:t>Bài 7. Cơ chế tăng giảm chiều dài tự động</w:t>
             </w:r>
           </w:p>
         </w:tc>
@@ -2445,15 +2557,17 @@
               <w:rPr>
                 <w:rFonts w:ascii="Times New Roman" w:hAnsi="Times New Roman"/>
                 <w:sz w:val="26"/>
-              </w:rPr>
-            </w:r>
-            <w:r>
-              <w:rPr>
-                <w:rFonts w:ascii="Times New Roman" w:hAnsi="Times New Roman"/>
-                <w:b w:val="0"/>
-                <w:sz w:val="26"/>
-              </w:rPr>
-              <w:t>17</w:t>
+                <w:rFonts w:ascii="Times New Roman" w:hAnsi="Times New Roman" w:cs="Times New Roman"/>
+              </w:rPr>
+            </w:r>
+            <w:r>
+              <w:rPr>
+                <w:rFonts w:ascii="Times New Roman" w:hAnsi="Times New Roman"/>
+                <w:b w:val="0"/>
+                <w:sz w:val="26"/>
+                <w:rFonts w:ascii="Times New Roman" w:hAnsi="Times New Roman" w:cs="Times New Roman"/>
+              </w:rPr>
+              <w:t>15, 16</w:t>
             </w:r>
           </w:p>
         </w:tc>
@@ -2469,15 +2583,17 @@
               <w:rPr>
                 <w:rFonts w:ascii="Times New Roman" w:hAnsi="Times New Roman"/>
                 <w:sz w:val="26"/>
-              </w:rPr>
-            </w:r>
-            <w:r>
-              <w:rPr>
-                <w:rFonts w:ascii="Times New Roman" w:hAnsi="Times New Roman"/>
-                <w:b w:val="0"/>
-                <w:sz w:val="26"/>
-              </w:rPr>
-              <w:t>Tìm hiểu cảm biến hồng ngoại phát hiện vật cản; lắp robot tự động tránh chướng ngại vật.</w:t>
+                <w:rFonts w:ascii="Times New Roman" w:hAnsi="Times New Roman" w:cs="Times New Roman"/>
+              </w:rPr>
+            </w:r>
+            <w:r>
+              <w:rPr>
+                <w:rFonts w:ascii="Times New Roman" w:hAnsi="Times New Roman"/>
+                <w:b w:val="0"/>
+                <w:sz w:val="26"/>
+                <w:rFonts w:ascii="Times New Roman" w:hAnsi="Times New Roman" w:cs="Times New Roman"/>
+              </w:rPr>
+              <w:t>Tìm hiểu cơ cấu kẹp linh hoạt và cánh tay robot; lắp robot gỡ bom/gắp vật xa.</w:t>
             </w:r>
           </w:p>
         </w:tc>
@@ -2496,15 +2612,17 @@
               <w:rPr>
                 <w:rFonts w:ascii="Times New Roman" w:hAnsi="Times New Roman"/>
                 <w:sz w:val="26"/>
-              </w:rPr>
-            </w:r>
-            <w:r>
-              <w:rPr>
-                <w:rFonts w:ascii="Times New Roman" w:hAnsi="Times New Roman"/>
-                <w:b/>
-                <w:sz w:val="26"/>
-              </w:rPr>
-              <w:t>11</w:t>
+                <w:rFonts w:ascii="Times New Roman" w:hAnsi="Times New Roman" w:cs="Times New Roman"/>
+              </w:rPr>
+            </w:r>
+            <w:r>
+              <w:rPr>
+                <w:rFonts w:ascii="Times New Roman" w:hAnsi="Times New Roman"/>
+                <w:b w:val="0"/>
+                <w:sz w:val="26"/>
+                <w:rFonts w:ascii="Times New Roman" w:hAnsi="Times New Roman" w:cs="Times New Roman"/>
+              </w:rPr>
+              <w:t>10</w:t>
             </w:r>
           </w:p>
         </w:tc>
@@ -2520,15 +2638,17 @@
               <w:rPr>
                 <w:rFonts w:ascii="Times New Roman" w:hAnsi="Times New Roman"/>
                 <w:sz w:val="26"/>
-              </w:rPr>
-            </w:r>
-            <w:r>
-              <w:rPr>
-                <w:rFonts w:ascii="Times New Roman" w:hAnsi="Times New Roman"/>
-                <w:b/>
-                <w:sz w:val="26"/>
-              </w:rPr>
-              <w:t>Ôn tập Đánh giá định kỳ 2</w:t>
+                <w:rFonts w:ascii="Times New Roman" w:hAnsi="Times New Roman" w:cs="Times New Roman"/>
+              </w:rPr>
+            </w:r>
+            <w:r>
+              <w:rPr>
+                <w:rFonts w:ascii="Times New Roman" w:hAnsi="Times New Roman"/>
+                <w:b w:val="0"/>
+                <w:sz w:val="26"/>
+                <w:rFonts w:ascii="Times New Roman" w:hAnsi="Times New Roman" w:cs="Times New Roman"/>
+              </w:rPr>
+              <w:t>Bài 8. Robot nhận biết vật thể bằng cách nào?</w:t>
             </w:r>
           </w:p>
         </w:tc>
@@ -2545,15 +2665,17 @@
               <w:rPr>
                 <w:rFonts w:ascii="Times New Roman" w:hAnsi="Times New Roman"/>
                 <w:sz w:val="26"/>
-              </w:rPr>
-            </w:r>
-            <w:r>
-              <w:rPr>
-                <w:rFonts w:ascii="Times New Roman" w:hAnsi="Times New Roman"/>
-                <w:b/>
-                <w:sz w:val="26"/>
-              </w:rPr>
-              <w:t>18</w:t>
+                <w:rFonts w:ascii="Times New Roman" w:hAnsi="Times New Roman" w:cs="Times New Roman"/>
+              </w:rPr>
+            </w:r>
+            <w:r>
+              <w:rPr>
+                <w:rFonts w:ascii="Times New Roman" w:hAnsi="Times New Roman"/>
+                <w:b w:val="0"/>
+                <w:sz w:val="26"/>
+                <w:rFonts w:ascii="Times New Roman" w:hAnsi="Times New Roman" w:cs="Times New Roman"/>
+              </w:rPr>
+              <w:t>17</w:t>
             </w:r>
           </w:p>
         </w:tc>
@@ -2569,15 +2691,17 @@
               <w:rPr>
                 <w:rFonts w:ascii="Times New Roman" w:hAnsi="Times New Roman"/>
                 <w:sz w:val="26"/>
-              </w:rPr>
-            </w:r>
-            <w:r>
-              <w:rPr>
-                <w:rFonts w:ascii="Times New Roman" w:hAnsi="Times New Roman"/>
-                <w:b w:val="0"/>
-                <w:sz w:val="26"/>
-              </w:rPr>
-              <w:t>Hệ thống hóa kiến thức chuẩn bị Đánh giá định kỳ 2.</w:t>
+                <w:rFonts w:ascii="Times New Roman" w:hAnsi="Times New Roman" w:cs="Times New Roman"/>
+              </w:rPr>
+            </w:r>
+            <w:r>
+              <w:rPr>
+                <w:rFonts w:ascii="Times New Roman" w:hAnsi="Times New Roman"/>
+                <w:b w:val="0"/>
+                <w:sz w:val="26"/>
+                <w:rFonts w:ascii="Times New Roman" w:hAnsi="Times New Roman" w:cs="Times New Roman"/>
+              </w:rPr>
+              <w:t>Tìm hiểu cảm biến hồng ngoại phát hiện vật cản; lắp robot tự động tránh chướng ngại vật.</w:t>
             </w:r>
           </w:p>
         </w:tc>
@@ -2596,6 +2720,7 @@
               <w:rPr>
                 <w:rFonts w:ascii="Times New Roman" w:hAnsi="Times New Roman"/>
                 <w:sz w:val="26"/>
+                <w:rFonts w:ascii="Times New Roman" w:hAnsi="Times New Roman" w:cs="Times New Roman"/>
               </w:rPr>
             </w:r>
             <w:r>
@@ -2603,8 +2728,9 @@
                 <w:rFonts w:ascii="Times New Roman" w:hAnsi="Times New Roman"/>
                 <w:b/>
                 <w:sz w:val="26"/>
-              </w:rPr>
-              <w:t>12</w:t>
+                <w:rFonts w:ascii="Times New Roman" w:hAnsi="Times New Roman" w:cs="Times New Roman"/>
+              </w:rPr>
+              <w:t>11</w:t>
             </w:r>
           </w:p>
         </w:tc>
@@ -2620,6 +2746,7 @@
               <w:rPr>
                 <w:rFonts w:ascii="Times New Roman" w:hAnsi="Times New Roman"/>
                 <w:sz w:val="26"/>
+                <w:rFonts w:ascii="Times New Roman" w:hAnsi="Times New Roman" w:cs="Times New Roman"/>
               </w:rPr>
             </w:r>
             <w:r>
@@ -2627,8 +2754,9 @@
                 <w:rFonts w:ascii="Times New Roman" w:hAnsi="Times New Roman"/>
                 <w:b/>
                 <w:sz w:val="26"/>
-              </w:rPr>
-              <w:t>Đánh giá định kỳ 2</w:t>
+                <w:rFonts w:ascii="Times New Roman" w:hAnsi="Times New Roman" w:cs="Times New Roman"/>
+              </w:rPr>
+              <w:t>Ôn tập Đánh giá định kỳ 2</w:t>
             </w:r>
           </w:p>
         </w:tc>
@@ -2645,6 +2773,7 @@
               <w:rPr>
                 <w:rFonts w:ascii="Times New Roman" w:hAnsi="Times New Roman"/>
                 <w:sz w:val="26"/>
+                <w:rFonts w:ascii="Times New Roman" w:hAnsi="Times New Roman" w:cs="Times New Roman"/>
               </w:rPr>
             </w:r>
             <w:r>
@@ -2652,8 +2781,9 @@
                 <w:rFonts w:ascii="Times New Roman" w:hAnsi="Times New Roman"/>
                 <w:b/>
                 <w:sz w:val="26"/>
-              </w:rPr>
-              <w:t>19</w:t>
+                <w:rFonts w:ascii="Times New Roman" w:hAnsi="Times New Roman" w:cs="Times New Roman"/>
+              </w:rPr>
+              <w:t>18</w:t>
             </w:r>
           </w:p>
         </w:tc>
@@ -2669,15 +2799,17 @@
               <w:rPr>
                 <w:rFonts w:ascii="Times New Roman" w:hAnsi="Times New Roman"/>
                 <w:sz w:val="26"/>
-              </w:rPr>
-            </w:r>
-            <w:r>
-              <w:rPr>
-                <w:rFonts w:ascii="Times New Roman" w:hAnsi="Times New Roman"/>
-                <w:b w:val="0"/>
-                <w:sz w:val="26"/>
-              </w:rPr>
-              <w:t>Kiểm tra đánh giá kết quả học tập thực hành Robotics.</w:t>
+                <w:rFonts w:ascii="Times New Roman" w:hAnsi="Times New Roman" w:cs="Times New Roman"/>
+              </w:rPr>
+            </w:r>
+            <w:r>
+              <w:rPr>
+                <w:rFonts w:ascii="Times New Roman" w:hAnsi="Times New Roman"/>
+                <w:b w:val="0"/>
+                <w:sz w:val="26"/>
+                <w:rFonts w:ascii="Times New Roman" w:hAnsi="Times New Roman" w:cs="Times New Roman"/>
+              </w:rPr>
+              <w:t>Hệ thống hóa kiến thức chuẩn bị Đánh giá định kỳ 2.</w:t>
             </w:r>
           </w:p>
         </w:tc>
@@ -2696,15 +2828,17 @@
               <w:rPr>
                 <w:rFonts w:ascii="Times New Roman" w:hAnsi="Times New Roman"/>
                 <w:sz w:val="26"/>
-              </w:rPr>
-            </w:r>
-            <w:r>
-              <w:rPr>
-                <w:rFonts w:ascii="Times New Roman" w:hAnsi="Times New Roman"/>
-                <w:b w:val="0"/>
-                <w:sz w:val="26"/>
-              </w:rPr>
-              <w:t>13</w:t>
+                <w:rFonts w:ascii="Times New Roman" w:hAnsi="Times New Roman" w:cs="Times New Roman"/>
+              </w:rPr>
+            </w:r>
+            <w:r>
+              <w:rPr>
+                <w:rFonts w:ascii="Times New Roman" w:hAnsi="Times New Roman"/>
+                <w:b/>
+                <w:sz w:val="26"/>
+                <w:rFonts w:ascii="Times New Roman" w:hAnsi="Times New Roman" w:cs="Times New Roman"/>
+              </w:rPr>
+              <w:t>12</w:t>
             </w:r>
           </w:p>
         </w:tc>
@@ -2720,15 +2854,17 @@
               <w:rPr>
                 <w:rFonts w:ascii="Times New Roman" w:hAnsi="Times New Roman"/>
                 <w:sz w:val="26"/>
-              </w:rPr>
-            </w:r>
-            <w:r>
-              <w:rPr>
-                <w:rFonts w:ascii="Times New Roman" w:hAnsi="Times New Roman"/>
-                <w:b w:val="0"/>
-                <w:sz w:val="26"/>
-              </w:rPr>
-              <w:t>Bài 9. Số ngẫu nhiên</w:t>
+                <w:rFonts w:ascii="Times New Roman" w:hAnsi="Times New Roman" w:cs="Times New Roman"/>
+              </w:rPr>
+            </w:r>
+            <w:r>
+              <w:rPr>
+                <w:rFonts w:ascii="Times New Roman" w:hAnsi="Times New Roman"/>
+                <w:b/>
+                <w:sz w:val="26"/>
+                <w:rFonts w:ascii="Times New Roman" w:hAnsi="Times New Roman" w:cs="Times New Roman"/>
+              </w:rPr>
+              <w:t>Đánh giá định kỳ 2</w:t>
             </w:r>
           </w:p>
         </w:tc>
@@ -2745,15 +2881,17 @@
               <w:rPr>
                 <w:rFonts w:ascii="Times New Roman" w:hAnsi="Times New Roman"/>
                 <w:sz w:val="26"/>
-              </w:rPr>
-            </w:r>
-            <w:r>
-              <w:rPr>
-                <w:rFonts w:ascii="Times New Roman" w:hAnsi="Times New Roman"/>
-                <w:b w:val="0"/>
-                <w:sz w:val="26"/>
-              </w:rPr>
-              <w:t>20, 21</w:t>
+                <w:rFonts w:ascii="Times New Roman" w:hAnsi="Times New Roman" w:cs="Times New Roman"/>
+              </w:rPr>
+            </w:r>
+            <w:r>
+              <w:rPr>
+                <w:rFonts w:ascii="Times New Roman" w:hAnsi="Times New Roman"/>
+                <w:b/>
+                <w:sz w:val="26"/>
+                <w:rFonts w:ascii="Times New Roman" w:hAnsi="Times New Roman" w:cs="Times New Roman"/>
+              </w:rPr>
+              <w:t>19</w:t>
             </w:r>
           </w:p>
         </w:tc>
@@ -2769,15 +2907,17 @@
               <w:rPr>
                 <w:rFonts w:ascii="Times New Roman" w:hAnsi="Times New Roman"/>
                 <w:sz w:val="26"/>
-              </w:rPr>
-            </w:r>
-            <w:r>
-              <w:rPr>
-                <w:rFonts w:ascii="Times New Roman" w:hAnsi="Times New Roman"/>
-                <w:b w:val="0"/>
-                <w:sz w:val="26"/>
-              </w:rPr>
-              <w:t>Ứng dụng thuật toán số ngẫu nhiên trong điều khiển robot hoạt động tự động.</w:t>
+                <w:rFonts w:ascii="Times New Roman" w:hAnsi="Times New Roman" w:cs="Times New Roman"/>
+              </w:rPr>
+            </w:r>
+            <w:r>
+              <w:rPr>
+                <w:rFonts w:ascii="Times New Roman" w:hAnsi="Times New Roman"/>
+                <w:b w:val="0"/>
+                <w:sz w:val="26"/>
+                <w:rFonts w:ascii="Times New Roman" w:hAnsi="Times New Roman" w:cs="Times New Roman"/>
+              </w:rPr>
+              <w:t>Kiểm tra đánh giá kết quả học tập thực hành Robotics.</w:t>
             </w:r>
           </w:p>
         </w:tc>
@@ -2796,15 +2936,17 @@
               <w:rPr>
                 <w:rFonts w:ascii="Times New Roman" w:hAnsi="Times New Roman"/>
                 <w:sz w:val="26"/>
-              </w:rPr>
-            </w:r>
-            <w:r>
-              <w:rPr>
-                <w:rFonts w:ascii="Times New Roman" w:hAnsi="Times New Roman"/>
-                <w:b w:val="0"/>
-                <w:sz w:val="26"/>
-              </w:rPr>
-              <w:t>14</w:t>
+                <w:rFonts w:ascii="Times New Roman" w:hAnsi="Times New Roman" w:cs="Times New Roman"/>
+              </w:rPr>
+            </w:r>
+            <w:r>
+              <w:rPr>
+                <w:rFonts w:ascii="Times New Roman" w:hAnsi="Times New Roman"/>
+                <w:b w:val="0"/>
+                <w:sz w:val="26"/>
+                <w:rFonts w:ascii="Times New Roman" w:hAnsi="Times New Roman" w:cs="Times New Roman"/>
+              </w:rPr>
+              <w:t>13</w:t>
             </w:r>
           </w:p>
         </w:tc>
@@ -2820,15 +2962,17 @@
               <w:rPr>
                 <w:rFonts w:ascii="Times New Roman" w:hAnsi="Times New Roman"/>
                 <w:sz w:val="26"/>
-              </w:rPr>
-            </w:r>
-            <w:r>
-              <w:rPr>
-                <w:rFonts w:ascii="Times New Roman" w:hAnsi="Times New Roman"/>
-                <w:b w:val="0"/>
-                <w:sz w:val="26"/>
-              </w:rPr>
-              <w:t>Bài 10. Robot hút bụi</w:t>
+                <w:rFonts w:ascii="Times New Roman" w:hAnsi="Times New Roman" w:cs="Times New Roman"/>
+              </w:rPr>
+            </w:r>
+            <w:r>
+              <w:rPr>
+                <w:rFonts w:ascii="Times New Roman" w:hAnsi="Times New Roman"/>
+                <w:b w:val="0"/>
+                <w:sz w:val="26"/>
+                <w:rFonts w:ascii="Times New Roman" w:hAnsi="Times New Roman" w:cs="Times New Roman"/>
+              </w:rPr>
+              <w:t>Bài 9. Số ngẫu nhiên</w:t>
             </w:r>
           </w:p>
         </w:tc>
@@ -2845,15 +2989,17 @@
               <w:rPr>
                 <w:rFonts w:ascii="Times New Roman" w:hAnsi="Times New Roman"/>
                 <w:sz w:val="26"/>
-              </w:rPr>
-            </w:r>
-            <w:r>
-              <w:rPr>
-                <w:rFonts w:ascii="Times New Roman" w:hAnsi="Times New Roman"/>
-                <w:b w:val="0"/>
-                <w:sz w:val="26"/>
-              </w:rPr>
-              <w:t>22, 23</w:t>
+                <w:rFonts w:ascii="Times New Roman" w:hAnsi="Times New Roman" w:cs="Times New Roman"/>
+              </w:rPr>
+            </w:r>
+            <w:r>
+              <w:rPr>
+                <w:rFonts w:ascii="Times New Roman" w:hAnsi="Times New Roman"/>
+                <w:b w:val="0"/>
+                <w:sz w:val="26"/>
+                <w:rFonts w:ascii="Times New Roman" w:hAnsi="Times New Roman" w:cs="Times New Roman"/>
+              </w:rPr>
+              <w:t>20, 21</w:t>
             </w:r>
           </w:p>
         </w:tc>
@@ -2869,15 +3015,17 @@
               <w:rPr>
                 <w:rFonts w:ascii="Times New Roman" w:hAnsi="Times New Roman"/>
                 <w:sz w:val="26"/>
-              </w:rPr>
-            </w:r>
-            <w:r>
-              <w:rPr>
-                <w:rFonts w:ascii="Times New Roman" w:hAnsi="Times New Roman"/>
-                <w:b w:val="0"/>
-                <w:sz w:val="26"/>
-              </w:rPr>
-              <w:t>Tìm hiểu chức năng robot dọn dẹp; lắp và lập trình robot hút bụi tự động.</w:t>
+                <w:rFonts w:ascii="Times New Roman" w:hAnsi="Times New Roman" w:cs="Times New Roman"/>
+              </w:rPr>
+            </w:r>
+            <w:r>
+              <w:rPr>
+                <w:rFonts w:ascii="Times New Roman" w:hAnsi="Times New Roman"/>
+                <w:b w:val="0"/>
+                <w:sz w:val="26"/>
+                <w:rFonts w:ascii="Times New Roman" w:hAnsi="Times New Roman" w:cs="Times New Roman"/>
+              </w:rPr>
+              <w:t>Ứng dụng thuật toán số ngẫu nhiên trong điều khiển robot hoạt động tự động.</w:t>
             </w:r>
           </w:p>
         </w:tc>
@@ -2896,15 +3044,17 @@
               <w:rPr>
                 <w:rFonts w:ascii="Times New Roman" w:hAnsi="Times New Roman"/>
                 <w:sz w:val="26"/>
-              </w:rPr>
-            </w:r>
-            <w:r>
-              <w:rPr>
-                <w:rFonts w:ascii="Times New Roman" w:hAnsi="Times New Roman"/>
-                <w:b w:val="0"/>
-                <w:sz w:val="26"/>
-              </w:rPr>
-              <w:t>15</w:t>
+                <w:rFonts w:ascii="Times New Roman" w:hAnsi="Times New Roman" w:cs="Times New Roman"/>
+              </w:rPr>
+            </w:r>
+            <w:r>
+              <w:rPr>
+                <w:rFonts w:ascii="Times New Roman" w:hAnsi="Times New Roman"/>
+                <w:b w:val="0"/>
+                <w:sz w:val="26"/>
+                <w:rFonts w:ascii="Times New Roman" w:hAnsi="Times New Roman" w:cs="Times New Roman"/>
+              </w:rPr>
+              <w:t>14</w:t>
             </w:r>
           </w:p>
         </w:tc>
@@ -2920,15 +3070,17 @@
               <w:rPr>
                 <w:rFonts w:ascii="Times New Roman" w:hAnsi="Times New Roman"/>
                 <w:sz w:val="26"/>
-              </w:rPr>
-            </w:r>
-            <w:r>
-              <w:rPr>
-                <w:rFonts w:ascii="Times New Roman" w:hAnsi="Times New Roman"/>
-                <w:b w:val="0"/>
-                <w:sz w:val="26"/>
-              </w:rPr>
-              <w:t>Bài 11. Lực hấp dẫn</w:t>
+                <w:rFonts w:ascii="Times New Roman" w:hAnsi="Times New Roman" w:cs="Times New Roman"/>
+              </w:rPr>
+            </w:r>
+            <w:r>
+              <w:rPr>
+                <w:rFonts w:ascii="Times New Roman" w:hAnsi="Times New Roman"/>
+                <w:b w:val="0"/>
+                <w:sz w:val="26"/>
+                <w:rFonts w:ascii="Times New Roman" w:hAnsi="Times New Roman" w:cs="Times New Roman"/>
+              </w:rPr>
+              <w:t>Bài 10. Robot hút bụi</w:t>
             </w:r>
           </w:p>
         </w:tc>
@@ -2945,15 +3097,17 @@
               <w:rPr>
                 <w:rFonts w:ascii="Times New Roman" w:hAnsi="Times New Roman"/>
                 <w:sz w:val="26"/>
-              </w:rPr>
-            </w:r>
-            <w:r>
-              <w:rPr>
-                <w:rFonts w:ascii="Times New Roman" w:hAnsi="Times New Roman"/>
-                <w:b w:val="0"/>
-                <w:sz w:val="26"/>
-              </w:rPr>
-              <w:t>24, 25</w:t>
+                <w:rFonts w:ascii="Times New Roman" w:hAnsi="Times New Roman" w:cs="Times New Roman"/>
+              </w:rPr>
+            </w:r>
+            <w:r>
+              <w:rPr>
+                <w:rFonts w:ascii="Times New Roman" w:hAnsi="Times New Roman"/>
+                <w:b w:val="0"/>
+                <w:sz w:val="26"/>
+                <w:rFonts w:ascii="Times New Roman" w:hAnsi="Times New Roman" w:cs="Times New Roman"/>
+              </w:rPr>
+              <w:t>22, 23</w:t>
             </w:r>
           </w:p>
         </w:tc>
@@ -2969,15 +3123,17 @@
               <w:rPr>
                 <w:rFonts w:ascii="Times New Roman" w:hAnsi="Times New Roman"/>
                 <w:sz w:val="26"/>
-              </w:rPr>
-            </w:r>
-            <w:r>
-              <w:rPr>
-                <w:rFonts w:ascii="Times New Roman" w:hAnsi="Times New Roman"/>
-                <w:b w:val="0"/>
-                <w:sz w:val="26"/>
-              </w:rPr>
-              <w:t>Tìm hiểu trọng lực và ứng dụng; chế tạo robot Rodeo sử dụng lực hấp dẫn.</w:t>
+                <w:rFonts w:ascii="Times New Roman" w:hAnsi="Times New Roman" w:cs="Times New Roman"/>
+              </w:rPr>
+            </w:r>
+            <w:r>
+              <w:rPr>
+                <w:rFonts w:ascii="Times New Roman" w:hAnsi="Times New Roman"/>
+                <w:b w:val="0"/>
+                <w:sz w:val="26"/>
+                <w:rFonts w:ascii="Times New Roman" w:hAnsi="Times New Roman" w:cs="Times New Roman"/>
+              </w:rPr>
+              <w:t>Tìm hiểu chức năng robot dọn dẹp; lắp và lập trình robot hút bụi tự động.</w:t>
             </w:r>
           </w:p>
         </w:tc>
@@ -2996,15 +3152,17 @@
               <w:rPr>
                 <w:rFonts w:ascii="Times New Roman" w:hAnsi="Times New Roman"/>
                 <w:sz w:val="26"/>
-              </w:rPr>
-            </w:r>
-            <w:r>
-              <w:rPr>
-                <w:rFonts w:ascii="Times New Roman" w:hAnsi="Times New Roman"/>
-                <w:b w:val="0"/>
-                <w:sz w:val="26"/>
-              </w:rPr>
-              <w:t>16</w:t>
+                <w:rFonts w:ascii="Times New Roman" w:hAnsi="Times New Roman" w:cs="Times New Roman"/>
+              </w:rPr>
+            </w:r>
+            <w:r>
+              <w:rPr>
+                <w:rFonts w:ascii="Times New Roman" w:hAnsi="Times New Roman"/>
+                <w:b w:val="0"/>
+                <w:sz w:val="26"/>
+                <w:rFonts w:ascii="Times New Roman" w:hAnsi="Times New Roman" w:cs="Times New Roman"/>
+              </w:rPr>
+              <w:t>15</w:t>
             </w:r>
           </w:p>
         </w:tc>
@@ -3020,15 +3178,17 @@
               <w:rPr>
                 <w:rFonts w:ascii="Times New Roman" w:hAnsi="Times New Roman"/>
                 <w:sz w:val="26"/>
-              </w:rPr>
-            </w:r>
-            <w:r>
-              <w:rPr>
-                <w:rFonts w:ascii="Times New Roman" w:hAnsi="Times New Roman"/>
-                <w:b w:val="0"/>
-                <w:sz w:val="26"/>
-              </w:rPr>
-              <w:t>Bài 12. Domino trong Robotics</w:t>
+                <w:rFonts w:ascii="Times New Roman" w:hAnsi="Times New Roman" w:cs="Times New Roman"/>
+              </w:rPr>
+            </w:r>
+            <w:r>
+              <w:rPr>
+                <w:rFonts w:ascii="Times New Roman" w:hAnsi="Times New Roman"/>
+                <w:b w:val="0"/>
+                <w:sz w:val="26"/>
+                <w:rFonts w:ascii="Times New Roman" w:hAnsi="Times New Roman" w:cs="Times New Roman"/>
+              </w:rPr>
+              <w:t>Bài 11. Lực hấp dẫn</w:t>
             </w:r>
           </w:p>
         </w:tc>
@@ -3045,15 +3205,17 @@
               <w:rPr>
                 <w:rFonts w:ascii="Times New Roman" w:hAnsi="Times New Roman"/>
                 <w:sz w:val="26"/>
-              </w:rPr>
-            </w:r>
-            <w:r>
-              <w:rPr>
-                <w:rFonts w:ascii="Times New Roman" w:hAnsi="Times New Roman"/>
-                <w:b w:val="0"/>
-                <w:sz w:val="26"/>
-              </w:rPr>
-              <w:t>26</w:t>
+                <w:rFonts w:ascii="Times New Roman" w:hAnsi="Times New Roman" w:cs="Times New Roman"/>
+              </w:rPr>
+            </w:r>
+            <w:r>
+              <w:rPr>
+                <w:rFonts w:ascii="Times New Roman" w:hAnsi="Times New Roman"/>
+                <w:b w:val="0"/>
+                <w:sz w:val="26"/>
+                <w:rFonts w:ascii="Times New Roman" w:hAnsi="Times New Roman" w:cs="Times New Roman"/>
+              </w:rPr>
+              <w:t>24, 25</w:t>
             </w:r>
           </w:p>
         </w:tc>
@@ -3069,15 +3231,17 @@
               <w:rPr>
                 <w:rFonts w:ascii="Times New Roman" w:hAnsi="Times New Roman"/>
                 <w:sz w:val="26"/>
-              </w:rPr>
-            </w:r>
-            <w:r>
-              <w:rPr>
-                <w:rFonts w:ascii="Times New Roman" w:hAnsi="Times New Roman"/>
-                <w:b w:val="0"/>
-                <w:sz w:val="26"/>
-              </w:rPr>
-              <w:t>Tìm hiểu chuyển động chính xác; lắp robot xếp khối domino tự động.</w:t>
+                <w:rFonts w:ascii="Times New Roman" w:hAnsi="Times New Roman" w:cs="Times New Roman"/>
+              </w:rPr>
+            </w:r>
+            <w:r>
+              <w:rPr>
+                <w:rFonts w:ascii="Times New Roman" w:hAnsi="Times New Roman"/>
+                <w:b w:val="0"/>
+                <w:sz w:val="26"/>
+                <w:rFonts w:ascii="Times New Roman" w:hAnsi="Times New Roman" w:cs="Times New Roman"/>
+              </w:rPr>
+              <w:t>Tìm hiểu trọng lực và ứng dụng; chế tạo robot Rodeo sử dụng lực hấp dẫn.</w:t>
             </w:r>
           </w:p>
         </w:tc>
@@ -3096,15 +3260,17 @@
               <w:rPr>
                 <w:rFonts w:ascii="Times New Roman" w:hAnsi="Times New Roman"/>
                 <w:sz w:val="26"/>
-              </w:rPr>
-            </w:r>
-            <w:r>
-              <w:rPr>
-                <w:rFonts w:ascii="Times New Roman" w:hAnsi="Times New Roman"/>
-                <w:b/>
-                <w:sz w:val="26"/>
-              </w:rPr>
-              <w:t>17</w:t>
+                <w:rFonts w:ascii="Times New Roman" w:hAnsi="Times New Roman" w:cs="Times New Roman"/>
+              </w:rPr>
+            </w:r>
+            <w:r>
+              <w:rPr>
+                <w:rFonts w:ascii="Times New Roman" w:hAnsi="Times New Roman"/>
+                <w:b w:val="0"/>
+                <w:sz w:val="26"/>
+                <w:rFonts w:ascii="Times New Roman" w:hAnsi="Times New Roman" w:cs="Times New Roman"/>
+              </w:rPr>
+              <w:t>16</w:t>
             </w:r>
           </w:p>
         </w:tc>
@@ -3120,15 +3286,17 @@
               <w:rPr>
                 <w:rFonts w:ascii="Times New Roman" w:hAnsi="Times New Roman"/>
                 <w:sz w:val="26"/>
-              </w:rPr>
-            </w:r>
-            <w:r>
-              <w:rPr>
-                <w:rFonts w:ascii="Times New Roman" w:hAnsi="Times New Roman"/>
-                <w:b/>
-                <w:sz w:val="26"/>
-              </w:rPr>
-              <w:t>Ôn tập Đánh giá định kỳ 3</w:t>
+                <w:rFonts w:ascii="Times New Roman" w:hAnsi="Times New Roman" w:cs="Times New Roman"/>
+              </w:rPr>
+            </w:r>
+            <w:r>
+              <w:rPr>
+                <w:rFonts w:ascii="Times New Roman" w:hAnsi="Times New Roman"/>
+                <w:b w:val="0"/>
+                <w:sz w:val="26"/>
+                <w:rFonts w:ascii="Times New Roman" w:hAnsi="Times New Roman" w:cs="Times New Roman"/>
+              </w:rPr>
+              <w:t>Bài 12. Domino trong Robotics</w:t>
             </w:r>
           </w:p>
         </w:tc>
@@ -3145,15 +3313,17 @@
               <w:rPr>
                 <w:rFonts w:ascii="Times New Roman" w:hAnsi="Times New Roman"/>
                 <w:sz w:val="26"/>
-              </w:rPr>
-            </w:r>
-            <w:r>
-              <w:rPr>
-                <w:rFonts w:ascii="Times New Roman" w:hAnsi="Times New Roman"/>
-                <w:b/>
-                <w:sz w:val="26"/>
-              </w:rPr>
-              <w:t>27</w:t>
+                <w:rFonts w:ascii="Times New Roman" w:hAnsi="Times New Roman" w:cs="Times New Roman"/>
+              </w:rPr>
+            </w:r>
+            <w:r>
+              <w:rPr>
+                <w:rFonts w:ascii="Times New Roman" w:hAnsi="Times New Roman"/>
+                <w:b w:val="0"/>
+                <w:sz w:val="26"/>
+                <w:rFonts w:ascii="Times New Roman" w:hAnsi="Times New Roman" w:cs="Times New Roman"/>
+              </w:rPr>
+              <w:t>26</w:t>
             </w:r>
           </w:p>
         </w:tc>
@@ -3169,15 +3339,17 @@
               <w:rPr>
                 <w:rFonts w:ascii="Times New Roman" w:hAnsi="Times New Roman"/>
                 <w:sz w:val="26"/>
-              </w:rPr>
-            </w:r>
-            <w:r>
-              <w:rPr>
-                <w:rFonts w:ascii="Times New Roman" w:hAnsi="Times New Roman"/>
-                <w:b w:val="0"/>
-                <w:sz w:val="26"/>
-              </w:rPr>
-              <w:t>Hệ thống hóa kiến thức chuẩn bị Đánh giá định kỳ 3.</w:t>
+                <w:rFonts w:ascii="Times New Roman" w:hAnsi="Times New Roman" w:cs="Times New Roman"/>
+              </w:rPr>
+            </w:r>
+            <w:r>
+              <w:rPr>
+                <w:rFonts w:ascii="Times New Roman" w:hAnsi="Times New Roman"/>
+                <w:b w:val="0"/>
+                <w:sz w:val="26"/>
+                <w:rFonts w:ascii="Times New Roman" w:hAnsi="Times New Roman" w:cs="Times New Roman"/>
+              </w:rPr>
+              <w:t>Tìm hiểu chuyển động chính xác; lắp robot xếp khối domino tự động.</w:t>
             </w:r>
           </w:p>
         </w:tc>
@@ -3196,6 +3368,7 @@
               <w:rPr>
                 <w:rFonts w:ascii="Times New Roman" w:hAnsi="Times New Roman"/>
                 <w:sz w:val="26"/>
+                <w:rFonts w:ascii="Times New Roman" w:hAnsi="Times New Roman" w:cs="Times New Roman"/>
               </w:rPr>
             </w:r>
             <w:r>
@@ -3203,8 +3376,9 @@
                 <w:rFonts w:ascii="Times New Roman" w:hAnsi="Times New Roman"/>
                 <w:b/>
                 <w:sz w:val="26"/>
-              </w:rPr>
-              <w:t>18</w:t>
+                <w:rFonts w:ascii="Times New Roman" w:hAnsi="Times New Roman" w:cs="Times New Roman"/>
+              </w:rPr>
+              <w:t>17</w:t>
             </w:r>
           </w:p>
         </w:tc>
@@ -3220,6 +3394,7 @@
               <w:rPr>
                 <w:rFonts w:ascii="Times New Roman" w:hAnsi="Times New Roman"/>
                 <w:sz w:val="26"/>
+                <w:rFonts w:ascii="Times New Roman" w:hAnsi="Times New Roman" w:cs="Times New Roman"/>
               </w:rPr>
             </w:r>
             <w:r>
@@ -3227,8 +3402,9 @@
                 <w:rFonts w:ascii="Times New Roman" w:hAnsi="Times New Roman"/>
                 <w:b/>
                 <w:sz w:val="26"/>
-              </w:rPr>
-              <w:t>Đánh giá định kỳ 3</w:t>
+                <w:rFonts w:ascii="Times New Roman" w:hAnsi="Times New Roman" w:cs="Times New Roman"/>
+              </w:rPr>
+              <w:t>Ôn tập Đánh giá định kỳ 3</w:t>
             </w:r>
           </w:p>
         </w:tc>
@@ -3245,6 +3421,7 @@
               <w:rPr>
                 <w:rFonts w:ascii="Times New Roman" w:hAnsi="Times New Roman"/>
                 <w:sz w:val="26"/>
+                <w:rFonts w:ascii="Times New Roman" w:hAnsi="Times New Roman" w:cs="Times New Roman"/>
               </w:rPr>
             </w:r>
             <w:r>
@@ -3252,8 +3429,9 @@
                 <w:rFonts w:ascii="Times New Roman" w:hAnsi="Times New Roman"/>
                 <w:b/>
                 <w:sz w:val="26"/>
-              </w:rPr>
-              <w:t>28</w:t>
+                <w:rFonts w:ascii="Times New Roman" w:hAnsi="Times New Roman" w:cs="Times New Roman"/>
+              </w:rPr>
+              <w:t>27</w:t>
             </w:r>
           </w:p>
         </w:tc>
@@ -3269,15 +3447,17 @@
               <w:rPr>
                 <w:rFonts w:ascii="Times New Roman" w:hAnsi="Times New Roman"/>
                 <w:sz w:val="26"/>
-              </w:rPr>
-            </w:r>
-            <w:r>
-              <w:rPr>
-                <w:rFonts w:ascii="Times New Roman" w:hAnsi="Times New Roman"/>
-                <w:b w:val="0"/>
-                <w:sz w:val="26"/>
-              </w:rPr>
-              <w:t>Kiểm tra đánh giá kết quả học tập thực hành Robotics.</w:t>
+                <w:rFonts w:ascii="Times New Roman" w:hAnsi="Times New Roman" w:cs="Times New Roman"/>
+              </w:rPr>
+            </w:r>
+            <w:r>
+              <w:rPr>
+                <w:rFonts w:ascii="Times New Roman" w:hAnsi="Times New Roman"/>
+                <w:b w:val="0"/>
+                <w:sz w:val="26"/>
+                <w:rFonts w:ascii="Times New Roman" w:hAnsi="Times New Roman" w:cs="Times New Roman"/>
+              </w:rPr>
+              <w:t>Hệ thống hóa kiến thức chuẩn bị Đánh giá định kỳ 3.</w:t>
             </w:r>
           </w:p>
         </w:tc>
@@ -3296,15 +3476,17 @@
               <w:rPr>
                 <w:rFonts w:ascii="Times New Roman" w:hAnsi="Times New Roman"/>
                 <w:sz w:val="26"/>
-              </w:rPr>
-            </w:r>
-            <w:r>
-              <w:rPr>
-                <w:rFonts w:ascii="Times New Roman" w:hAnsi="Times New Roman"/>
-                <w:b w:val="0"/>
-                <w:sz w:val="26"/>
-              </w:rPr>
-              <w:t>19</w:t>
+                <w:rFonts w:ascii="Times New Roman" w:hAnsi="Times New Roman" w:cs="Times New Roman"/>
+              </w:rPr>
+            </w:r>
+            <w:r>
+              <w:rPr>
+                <w:rFonts w:ascii="Times New Roman" w:hAnsi="Times New Roman"/>
+                <w:b/>
+                <w:sz w:val="26"/>
+                <w:rFonts w:ascii="Times New Roman" w:hAnsi="Times New Roman" w:cs="Times New Roman"/>
+              </w:rPr>
+              <w:t>18</w:t>
             </w:r>
           </w:p>
         </w:tc>
@@ -3320,15 +3502,17 @@
               <w:rPr>
                 <w:rFonts w:ascii="Times New Roman" w:hAnsi="Times New Roman"/>
                 <w:sz w:val="26"/>
-              </w:rPr>
-            </w:r>
-            <w:r>
-              <w:rPr>
-                <w:rFonts w:ascii="Times New Roman" w:hAnsi="Times New Roman"/>
-                <w:b w:val="0"/>
-                <w:sz w:val="26"/>
-              </w:rPr>
-              <w:t>Bài 13. Robot phục vụ đời sống</w:t>
+                <w:rFonts w:ascii="Times New Roman" w:hAnsi="Times New Roman" w:cs="Times New Roman"/>
+              </w:rPr>
+            </w:r>
+            <w:r>
+              <w:rPr>
+                <w:rFonts w:ascii="Times New Roman" w:hAnsi="Times New Roman"/>
+                <w:b/>
+                <w:sz w:val="26"/>
+                <w:rFonts w:ascii="Times New Roman" w:hAnsi="Times New Roman" w:cs="Times New Roman"/>
+              </w:rPr>
+              <w:t>Đánh giá định kỳ 3</w:t>
             </w:r>
           </w:p>
         </w:tc>
@@ -3345,15 +3529,17 @@
               <w:rPr>
                 <w:rFonts w:ascii="Times New Roman" w:hAnsi="Times New Roman"/>
                 <w:sz w:val="26"/>
-              </w:rPr>
-            </w:r>
-            <w:r>
-              <w:rPr>
-                <w:rFonts w:ascii="Times New Roman" w:hAnsi="Times New Roman"/>
-                <w:b w:val="0"/>
-                <w:sz w:val="26"/>
-              </w:rPr>
-              <w:t>29</w:t>
+                <w:rFonts w:ascii="Times New Roman" w:hAnsi="Times New Roman" w:cs="Times New Roman"/>
+              </w:rPr>
+            </w:r>
+            <w:r>
+              <w:rPr>
+                <w:rFonts w:ascii="Times New Roman" w:hAnsi="Times New Roman"/>
+                <w:b/>
+                <w:sz w:val="26"/>
+                <w:rFonts w:ascii="Times New Roman" w:hAnsi="Times New Roman" w:cs="Times New Roman"/>
+              </w:rPr>
+              <w:t>28</w:t>
             </w:r>
           </w:p>
         </w:tc>
@@ -3369,15 +3555,17 @@
               <w:rPr>
                 <w:rFonts w:ascii="Times New Roman" w:hAnsi="Times New Roman"/>
                 <w:sz w:val="26"/>
-              </w:rPr>
-            </w:r>
-            <w:r>
-              <w:rPr>
-                <w:rFonts w:ascii="Times New Roman" w:hAnsi="Times New Roman"/>
-                <w:b w:val="0"/>
-                <w:sz w:val="26"/>
-              </w:rPr>
-              <w:t>Tìm hiểu ứng dụng robot trong công nghiệp và đời sống.</w:t>
+                <w:rFonts w:ascii="Times New Roman" w:hAnsi="Times New Roman" w:cs="Times New Roman"/>
+              </w:rPr>
+            </w:r>
+            <w:r>
+              <w:rPr>
+                <w:rFonts w:ascii="Times New Roman" w:hAnsi="Times New Roman"/>
+                <w:b w:val="0"/>
+                <w:sz w:val="26"/>
+                <w:rFonts w:ascii="Times New Roman" w:hAnsi="Times New Roman" w:cs="Times New Roman"/>
+              </w:rPr>
+              <w:t>Kiểm tra đánh giá kết quả học tập thực hành Robotics.</w:t>
             </w:r>
           </w:p>
         </w:tc>
@@ -3396,15 +3584,17 @@
               <w:rPr>
                 <w:rFonts w:ascii="Times New Roman" w:hAnsi="Times New Roman"/>
                 <w:sz w:val="26"/>
-              </w:rPr>
-            </w:r>
-            <w:r>
-              <w:rPr>
-                <w:rFonts w:ascii="Times New Roman" w:hAnsi="Times New Roman"/>
-                <w:b w:val="0"/>
-                <w:sz w:val="26"/>
-              </w:rPr>
-              <w:t>20</w:t>
+                <w:rFonts w:ascii="Times New Roman" w:hAnsi="Times New Roman" w:cs="Times New Roman"/>
+              </w:rPr>
+            </w:r>
+            <w:r>
+              <w:rPr>
+                <w:rFonts w:ascii="Times New Roman" w:hAnsi="Times New Roman"/>
+                <w:b w:val="0"/>
+                <w:sz w:val="26"/>
+                <w:rFonts w:ascii="Times New Roman" w:hAnsi="Times New Roman" w:cs="Times New Roman"/>
+              </w:rPr>
+              <w:t>19</w:t>
             </w:r>
           </w:p>
         </w:tc>
@@ -3420,15 +3610,17 @@
               <w:rPr>
                 <w:rFonts w:ascii="Times New Roman" w:hAnsi="Times New Roman"/>
                 <w:sz w:val="26"/>
-              </w:rPr>
-            </w:r>
-            <w:r>
-              <w:rPr>
-                <w:rFonts w:ascii="Times New Roman" w:hAnsi="Times New Roman"/>
-                <w:b w:val="0"/>
-                <w:sz w:val="26"/>
-              </w:rPr>
-              <w:t>Luyện tập &amp; Thực hành sáng tạo Robotics</w:t>
+                <w:rFonts w:ascii="Times New Roman" w:hAnsi="Times New Roman" w:cs="Times New Roman"/>
+              </w:rPr>
+            </w:r>
+            <w:r>
+              <w:rPr>
+                <w:rFonts w:ascii="Times New Roman" w:hAnsi="Times New Roman"/>
+                <w:b w:val="0"/>
+                <w:sz w:val="26"/>
+                <w:rFonts w:ascii="Times New Roman" w:hAnsi="Times New Roman" w:cs="Times New Roman"/>
+              </w:rPr>
+              <w:t>Bài 13. Robot phục vụ đời sống</w:t>
             </w:r>
           </w:p>
         </w:tc>
@@ -3445,15 +3637,17 @@
               <w:rPr>
                 <w:rFonts w:ascii="Times New Roman" w:hAnsi="Times New Roman"/>
                 <w:sz w:val="26"/>
-              </w:rPr>
-            </w:r>
-            <w:r>
-              <w:rPr>
-                <w:rFonts w:ascii="Times New Roman" w:hAnsi="Times New Roman"/>
-                <w:b w:val="0"/>
-                <w:sz w:val="26"/>
-              </w:rPr>
-              <w:t>30 - 32</w:t>
+                <w:rFonts w:ascii="Times New Roman" w:hAnsi="Times New Roman" w:cs="Times New Roman"/>
+              </w:rPr>
+            </w:r>
+            <w:r>
+              <w:rPr>
+                <w:rFonts w:ascii="Times New Roman" w:hAnsi="Times New Roman"/>
+                <w:b w:val="0"/>
+                <w:sz w:val="26"/>
+                <w:rFonts w:ascii="Times New Roman" w:hAnsi="Times New Roman" w:cs="Times New Roman"/>
+              </w:rPr>
+              <w:t>29</w:t>
             </w:r>
           </w:p>
         </w:tc>
@@ -3469,15 +3663,17 @@
               <w:rPr>
                 <w:rFonts w:ascii="Times New Roman" w:hAnsi="Times New Roman"/>
                 <w:sz w:val="26"/>
-              </w:rPr>
-            </w:r>
-            <w:r>
-              <w:rPr>
-                <w:rFonts w:ascii="Times New Roman" w:hAnsi="Times New Roman"/>
-                <w:b w:val="0"/>
-                <w:sz w:val="26"/>
-              </w:rPr>
-              <w:t>Luyện tập nâng cao, mở rộng tính năng và thử nghiệm sản phẩm.</w:t>
+                <w:rFonts w:ascii="Times New Roman" w:hAnsi="Times New Roman" w:cs="Times New Roman"/>
+              </w:rPr>
+            </w:r>
+            <w:r>
+              <w:rPr>
+                <w:rFonts w:ascii="Times New Roman" w:hAnsi="Times New Roman"/>
+                <w:b w:val="0"/>
+                <w:sz w:val="26"/>
+                <w:rFonts w:ascii="Times New Roman" w:hAnsi="Times New Roman" w:cs="Times New Roman"/>
+              </w:rPr>
+              <w:t>Tìm hiểu ứng dụng robot trong công nghiệp và đời sống.</w:t>
             </w:r>
           </w:p>
         </w:tc>
@@ -3485,99 +3681,107 @@
       <w:tr>
         <w:tc>
           <w:tcPr>
-            <w:tcW w:type="dxa" w:w="846"/>
-          </w:tcPr>
-          <w:p>
-            <w:pPr>
-              <w:spacing w:before="20" w:after="20"/>
-              <w:jc w:val="center"/>
-            </w:pPr>
-            <w:r>
-              <w:rPr>
-                <w:rFonts w:ascii="Times New Roman" w:hAnsi="Times New Roman"/>
-                <w:sz w:val="26"/>
-              </w:rPr>
-            </w:r>
-            <w:r>
-              <w:rPr>
-                <w:rFonts w:ascii="Times New Roman" w:hAnsi="Times New Roman"/>
-                <w:b/>
-                <w:sz w:val="26"/>
-              </w:rPr>
-              <w:t>21</w:t>
-            </w:r>
-          </w:p>
-        </w:tc>
-        <w:tc>
-          <w:tcPr>
-            <w:tcW w:type="dxa" w:w="3118"/>
-          </w:tcPr>
-          <w:p>
-            <w:pPr>
-              <w:spacing w:before="20" w:after="20"/>
-            </w:pPr>
-            <w:r>
-              <w:rPr>
-                <w:rFonts w:ascii="Times New Roman" w:hAnsi="Times New Roman"/>
-                <w:sz w:val="26"/>
-              </w:rPr>
-            </w:r>
-            <w:r>
-              <w:rPr>
-                <w:rFonts w:ascii="Times New Roman" w:hAnsi="Times New Roman"/>
-                <w:b/>
-                <w:sz w:val="26"/>
-              </w:rPr>
-              <w:t>Ôn tập Đánh giá định kỳ 4</w:t>
-            </w:r>
-          </w:p>
-        </w:tc>
-        <w:tc>
-          <w:tcPr>
-            <w:tcW w:type="dxa" w:w="1134"/>
-          </w:tcPr>
-          <w:p>
-            <w:pPr>
-              <w:spacing w:before="20" w:after="20"/>
-              <w:jc w:val="center"/>
-            </w:pPr>
-            <w:r>
-              <w:rPr>
-                <w:rFonts w:ascii="Times New Roman" w:hAnsi="Times New Roman"/>
-                <w:sz w:val="26"/>
-              </w:rPr>
-            </w:r>
-            <w:r>
-              <w:rPr>
-                <w:rFonts w:ascii="Times New Roman" w:hAnsi="Times New Roman"/>
-                <w:b/>
-                <w:sz w:val="26"/>
-              </w:rPr>
-              <w:t>33</w:t>
-            </w:r>
-          </w:p>
-        </w:tc>
-        <w:tc>
-          <w:tcPr>
-            <w:tcW w:type="dxa" w:w="4536"/>
-          </w:tcPr>
-          <w:p>
-            <w:pPr>
-              <w:spacing w:before="20" w:after="20"/>
-            </w:pPr>
-            <w:r>
-              <w:rPr>
-                <w:rFonts w:ascii="Times New Roman" w:hAnsi="Times New Roman"/>
-                <w:sz w:val="26"/>
-              </w:rPr>
-            </w:r>
-            <w:r>
-              <w:rPr>
-                <w:rFonts w:ascii="Times New Roman" w:hAnsi="Times New Roman"/>
-                <w:b w:val="0"/>
-                <w:sz w:val="26"/>
-              </w:rPr>
-              <w:t>Hệ thống hóa kiến thức chuẩn bị Đánh giá định kỳ 4.</w:t>
+            <w:tcW w:w="846" w:type="dxa"/>
+          </w:tcPr>
+          <w:p>
+            <w:pPr>
+              <w:spacing w:before="20" w:after="20"/>
+              <w:jc w:val="center"/>
+            </w:pPr>
+            <w:r>
+              <w:rPr>
+                <w:rFonts w:ascii="Times New Roman" w:hAnsi="Times New Roman"/>
+                <w:sz w:val="26"/>
+                <w:rFonts w:ascii="Times New Roman" w:hAnsi="Times New Roman" w:cs="Times New Roman"/>
+              </w:rPr>
+            </w:r>
+            <w:r>
+              <w:rPr>
+                <w:rFonts w:ascii="Times New Roman" w:hAnsi="Times New Roman"/>
+                <w:b w:val="0"/>
+                <w:sz w:val="26"/>
+                <w:rFonts w:ascii="Times New Roman" w:hAnsi="Times New Roman" w:cs="Times New Roman"/>
+              </w:rPr>
+              <w:t>20</w:t>
+            </w:r>
+          </w:p>
+        </w:tc>
+        <w:tc>
+          <w:tcPr>
+            <w:tcW w:w="3118" w:type="dxa"/>
+          </w:tcPr>
+          <w:p>
+            <w:pPr>
+              <w:spacing w:before="20" w:after="20"/>
+            </w:pPr>
+            <w:r>
+              <w:rPr>
+                <w:rFonts w:ascii="Times New Roman" w:hAnsi="Times New Roman"/>
+                <w:sz w:val="26"/>
+                <w:rFonts w:ascii="Times New Roman" w:hAnsi="Times New Roman" w:cs="Times New Roman"/>
+              </w:rPr>
+            </w:r>
+            <w:r>
+              <w:rPr>
+                <w:rFonts w:ascii="Times New Roman" w:hAnsi="Times New Roman"/>
+                <w:b w:val="0"/>
+                <w:sz w:val="26"/>
+                <w:rFonts w:ascii="Times New Roman" w:hAnsi="Times New Roman" w:cs="Times New Roman"/>
+              </w:rPr>
+              <w:t>Luyện tập &amp; Thực hành sáng tạo Robotics</w:t>
+            </w:r>
+          </w:p>
+        </w:tc>
+        <w:tc>
+          <w:tcPr>
+            <w:tcW w:w="1134" w:type="dxa"/>
+          </w:tcPr>
+          <w:p>
+            <w:pPr>
+              <w:spacing w:before="20" w:after="20"/>
+              <w:jc w:val="center"/>
+            </w:pPr>
+            <w:r>
+              <w:rPr>
+                <w:rFonts w:ascii="Times New Roman" w:hAnsi="Times New Roman"/>
+                <w:sz w:val="26"/>
+                <w:rFonts w:ascii="Times New Roman" w:hAnsi="Times New Roman" w:cs="Times New Roman"/>
+              </w:rPr>
+            </w:r>
+            <w:r>
+              <w:rPr>
+                <w:rFonts w:ascii="Times New Roman" w:hAnsi="Times New Roman"/>
+                <w:b w:val="0"/>
+                <w:sz w:val="26"/>
+                <w:rFonts w:ascii="Times New Roman" w:hAnsi="Times New Roman" w:cs="Times New Roman"/>
+              </w:rPr>
+              <w:t>30 - 32</w:t>
+            </w:r>
+          </w:p>
+        </w:tc>
+        <w:tc>
+          <w:tcPr>
+            <w:tcW w:w="4536" w:type="dxa"/>
+          </w:tcPr>
+          <w:p>
+            <w:pPr>
+              <w:spacing w:before="20" w:after="20"/>
+            </w:pPr>
+            <w:r>
+              <w:rPr>
+                <w:rFonts w:ascii="Times New Roman" w:hAnsi="Times New Roman"/>
+                <w:sz w:val="26"/>
+                <w:rFonts w:ascii="Times New Roman" w:hAnsi="Times New Roman" w:cs="Times New Roman"/>
+              </w:rPr>
+            </w:r>
+            <w:r>
+              <w:rPr>
+                <w:rFonts w:ascii="Times New Roman" w:hAnsi="Times New Roman"/>
+                <w:b w:val="0"/>
+                <w:sz w:val="26"/>
+                <w:rFonts w:ascii="Times New Roman" w:hAnsi="Times New Roman" w:cs="Times New Roman"/>
+              </w:rPr>
+              <w:t>Luyện tập nâng cao, mở rộng tính năng và thử nghiệm sản phẩm.</w:t>
             </w:r>
           </w:p>
         </w:tc>
@@ -3596,6 +3800,7 @@
               <w:rPr>
                 <w:rFonts w:ascii="Times New Roman" w:hAnsi="Times New Roman"/>
                 <w:sz w:val="26"/>
+                <w:rFonts w:ascii="Times New Roman" w:hAnsi="Times New Roman" w:cs="Times New Roman"/>
               </w:rPr>
             </w:r>
             <w:r>
@@ -3603,8 +3808,9 @@
                 <w:rFonts w:ascii="Times New Roman" w:hAnsi="Times New Roman"/>
                 <w:b/>
                 <w:sz w:val="26"/>
-              </w:rPr>
-              <w:t>22</w:t>
+                <w:rFonts w:ascii="Times New Roman" w:hAnsi="Times New Roman" w:cs="Times New Roman"/>
+              </w:rPr>
+              <w:t>21</w:t>
             </w:r>
           </w:p>
         </w:tc>
@@ -3620,6 +3826,7 @@
               <w:rPr>
                 <w:rFonts w:ascii="Times New Roman" w:hAnsi="Times New Roman"/>
                 <w:sz w:val="26"/>
+                <w:rFonts w:ascii="Times New Roman" w:hAnsi="Times New Roman" w:cs="Times New Roman"/>
               </w:rPr>
             </w:r>
             <w:r>
@@ -3627,8 +3834,9 @@
                 <w:rFonts w:ascii="Times New Roman" w:hAnsi="Times New Roman"/>
                 <w:b/>
                 <w:sz w:val="26"/>
-              </w:rPr>
-              <w:t>Đánh giá định kỳ 4</w:t>
+                <w:rFonts w:ascii="Times New Roman" w:hAnsi="Times New Roman" w:cs="Times New Roman"/>
+              </w:rPr>
+              <w:t>Ôn tập Đánh giá định kỳ 4</w:t>
             </w:r>
           </w:p>
         </w:tc>
@@ -3645,6 +3853,7 @@
               <w:rPr>
                 <w:rFonts w:ascii="Times New Roman" w:hAnsi="Times New Roman"/>
                 <w:sz w:val="26"/>
+                <w:rFonts w:ascii="Times New Roman" w:hAnsi="Times New Roman" w:cs="Times New Roman"/>
               </w:rPr>
             </w:r>
             <w:r>
@@ -3652,8 +3861,9 @@
                 <w:rFonts w:ascii="Times New Roman" w:hAnsi="Times New Roman"/>
                 <w:b/>
                 <w:sz w:val="26"/>
-              </w:rPr>
-              <w:t>34</w:t>
+                <w:rFonts w:ascii="Times New Roman" w:hAnsi="Times New Roman" w:cs="Times New Roman"/>
+              </w:rPr>
+              <w:t>33</w:t>
             </w:r>
           </w:p>
         </w:tc>
@@ -3669,15 +3879,17 @@
               <w:rPr>
                 <w:rFonts w:ascii="Times New Roman" w:hAnsi="Times New Roman"/>
                 <w:sz w:val="26"/>
-              </w:rPr>
-            </w:r>
-            <w:r>
-              <w:rPr>
-                <w:rFonts w:ascii="Times New Roman" w:hAnsi="Times New Roman"/>
-                <w:b w:val="0"/>
-                <w:sz w:val="26"/>
-              </w:rPr>
-              <w:t>Kiểm tra đánh giá kết quả học tập thực hành Robotics.</w:t>
+                <w:rFonts w:ascii="Times New Roman" w:hAnsi="Times New Roman" w:cs="Times New Roman"/>
+              </w:rPr>
+            </w:r>
+            <w:r>
+              <w:rPr>
+                <w:rFonts w:ascii="Times New Roman" w:hAnsi="Times New Roman"/>
+                <w:b w:val="0"/>
+                <w:sz w:val="26"/>
+                <w:rFonts w:ascii="Times New Roman" w:hAnsi="Times New Roman" w:cs="Times New Roman"/>
+              </w:rPr>
+              <w:t>Hệ thống hóa kiến thức chuẩn bị Đánh giá định kỳ 4.</w:t>
             </w:r>
           </w:p>
         </w:tc>
@@ -3696,13 +3908,123 @@
               <w:rPr>
                 <w:rFonts w:ascii="Times New Roman" w:hAnsi="Times New Roman"/>
                 <w:sz w:val="26"/>
-              </w:rPr>
-            </w:r>
-            <w:r>
-              <w:rPr>
-                <w:rFonts w:ascii="Times New Roman" w:hAnsi="Times New Roman"/>
-                <w:b w:val="0"/>
-                <w:sz w:val="26"/>
+                <w:rFonts w:ascii="Times New Roman" w:hAnsi="Times New Roman" w:cs="Times New Roman"/>
+              </w:rPr>
+            </w:r>
+            <w:r>
+              <w:rPr>
+                <w:rFonts w:ascii="Times New Roman" w:hAnsi="Times New Roman"/>
+                <w:b/>
+                <w:sz w:val="26"/>
+                <w:rFonts w:ascii="Times New Roman" w:hAnsi="Times New Roman" w:cs="Times New Roman"/>
+              </w:rPr>
+              <w:t>22</w:t>
+            </w:r>
+          </w:p>
+        </w:tc>
+        <w:tc>
+          <w:tcPr>
+            <w:tcW w:type="dxa" w:w="3118"/>
+          </w:tcPr>
+          <w:p>
+            <w:pPr>
+              <w:spacing w:before="20" w:after="20"/>
+            </w:pPr>
+            <w:r>
+              <w:rPr>
+                <w:rFonts w:ascii="Times New Roman" w:hAnsi="Times New Roman"/>
+                <w:sz w:val="26"/>
+                <w:rFonts w:ascii="Times New Roman" w:hAnsi="Times New Roman" w:cs="Times New Roman"/>
+              </w:rPr>
+            </w:r>
+            <w:r>
+              <w:rPr>
+                <w:rFonts w:ascii="Times New Roman" w:hAnsi="Times New Roman"/>
+                <w:b/>
+                <w:sz w:val="26"/>
+                <w:rFonts w:ascii="Times New Roman" w:hAnsi="Times New Roman" w:cs="Times New Roman"/>
+              </w:rPr>
+              <w:t>Đánh giá định kỳ 4</w:t>
+            </w:r>
+          </w:p>
+        </w:tc>
+        <w:tc>
+          <w:tcPr>
+            <w:tcW w:type="dxa" w:w="1134"/>
+          </w:tcPr>
+          <w:p>
+            <w:pPr>
+              <w:spacing w:before="20" w:after="20"/>
+              <w:jc w:val="center"/>
+            </w:pPr>
+            <w:r>
+              <w:rPr>
+                <w:rFonts w:ascii="Times New Roman" w:hAnsi="Times New Roman"/>
+                <w:sz w:val="26"/>
+                <w:rFonts w:ascii="Times New Roman" w:hAnsi="Times New Roman" w:cs="Times New Roman"/>
+              </w:rPr>
+            </w:r>
+            <w:r>
+              <w:rPr>
+                <w:rFonts w:ascii="Times New Roman" w:hAnsi="Times New Roman"/>
+                <w:b/>
+                <w:sz w:val="26"/>
+                <w:rFonts w:ascii="Times New Roman" w:hAnsi="Times New Roman" w:cs="Times New Roman"/>
+              </w:rPr>
+              <w:t>34</w:t>
+            </w:r>
+          </w:p>
+        </w:tc>
+        <w:tc>
+          <w:tcPr>
+            <w:tcW w:type="dxa" w:w="4536"/>
+          </w:tcPr>
+          <w:p>
+            <w:pPr>
+              <w:spacing w:before="20" w:after="20"/>
+            </w:pPr>
+            <w:r>
+              <w:rPr>
+                <w:rFonts w:ascii="Times New Roman" w:hAnsi="Times New Roman"/>
+                <w:sz w:val="26"/>
+                <w:rFonts w:ascii="Times New Roman" w:hAnsi="Times New Roman" w:cs="Times New Roman"/>
+              </w:rPr>
+            </w:r>
+            <w:r>
+              <w:rPr>
+                <w:rFonts w:ascii="Times New Roman" w:hAnsi="Times New Roman"/>
+                <w:b w:val="0"/>
+                <w:sz w:val="26"/>
+                <w:rFonts w:ascii="Times New Roman" w:hAnsi="Times New Roman" w:cs="Times New Roman"/>
+              </w:rPr>
+              <w:t>Kiểm tra đánh giá kết quả học tập thực hành Robotics.</w:t>
+            </w:r>
+          </w:p>
+        </w:tc>
+      </w:tr>
+      <w:tr>
+        <w:tc>
+          <w:tcPr>
+            <w:tcW w:type="dxa" w:w="846"/>
+          </w:tcPr>
+          <w:p>
+            <w:pPr>
+              <w:spacing w:before="20" w:after="20"/>
+              <w:jc w:val="center"/>
+            </w:pPr>
+            <w:r>
+              <w:rPr>
+                <w:rFonts w:ascii="Times New Roman" w:hAnsi="Times New Roman"/>
+                <w:sz w:val="26"/>
+                <w:rFonts w:ascii="Times New Roman" w:hAnsi="Times New Roman" w:cs="Times New Roman"/>
+              </w:rPr>
+            </w:r>
+            <w:r>
+              <w:rPr>
+                <w:rFonts w:ascii="Times New Roman" w:hAnsi="Times New Roman"/>
+                <w:b w:val="0"/>
+                <w:sz w:val="26"/>
+                <w:rFonts w:ascii="Times New Roman" w:hAnsi="Times New Roman" w:cs="Times New Roman"/>
               </w:rPr>
               <w:t>23</w:t>
             </w:r>
@@ -3720,13 +4042,15 @@
               <w:rPr>
                 <w:rFonts w:ascii="Times New Roman" w:hAnsi="Times New Roman"/>
                 <w:sz w:val="26"/>
-              </w:rPr>
-            </w:r>
-            <w:r>
-              <w:rPr>
-                <w:rFonts w:ascii="Times New Roman" w:hAnsi="Times New Roman"/>
-                <w:b w:val="0"/>
-                <w:sz w:val="26"/>
+                <w:rFonts w:ascii="Times New Roman" w:hAnsi="Times New Roman" w:cs="Times New Roman"/>
+              </w:rPr>
+            </w:r>
+            <w:r>
+              <w:rPr>
+                <w:rFonts w:ascii="Times New Roman" w:hAnsi="Times New Roman"/>
+                <w:b w:val="0"/>
+                <w:sz w:val="26"/>
+                <w:rFonts w:ascii="Times New Roman" w:hAnsi="Times New Roman" w:cs="Times New Roman"/>
               </w:rPr>
               <w:t>Tổng kết môn học &amp; Triển lãm Robotics</w:t>
             </w:r>
@@ -3745,13 +4069,15 @@
               <w:rPr>
                 <w:rFonts w:ascii="Times New Roman" w:hAnsi="Times New Roman"/>
                 <w:sz w:val="26"/>
-              </w:rPr>
-            </w:r>
-            <w:r>
-              <w:rPr>
-                <w:rFonts w:ascii="Times New Roman" w:hAnsi="Times New Roman"/>
-                <w:b w:val="0"/>
-                <w:sz w:val="26"/>
+                <w:rFonts w:ascii="Times New Roman" w:hAnsi="Times New Roman" w:cs="Times New Roman"/>
+              </w:rPr>
+            </w:r>
+            <w:r>
+              <w:rPr>
+                <w:rFonts w:ascii="Times New Roman" w:hAnsi="Times New Roman"/>
+                <w:b w:val="0"/>
+                <w:sz w:val="26"/>
+                <w:rFonts w:ascii="Times New Roman" w:hAnsi="Times New Roman" w:cs="Times New Roman"/>
               </w:rPr>
               <w:t>35</w:t>
             </w:r>
@@ -3769,13 +4095,15 @@
               <w:rPr>
                 <w:rFonts w:ascii="Times New Roman" w:hAnsi="Times New Roman"/>
                 <w:sz w:val="26"/>
-              </w:rPr>
-            </w:r>
-            <w:r>
-              <w:rPr>
-                <w:rFonts w:ascii="Times New Roman" w:hAnsi="Times New Roman"/>
-                <w:b w:val="0"/>
-                <w:sz w:val="26"/>
+                <w:rFonts w:ascii="Times New Roman" w:hAnsi="Times New Roman" w:cs="Times New Roman"/>
+              </w:rPr>
+            </w:r>
+            <w:r>
+              <w:rPr>
+                <w:rFonts w:ascii="Times New Roman" w:hAnsi="Times New Roman"/>
+                <w:b w:val="0"/>
+                <w:sz w:val="26"/>
+                <w:rFonts w:ascii="Times New Roman" w:hAnsi="Times New Roman" w:cs="Times New Roman"/>
               </w:rPr>
               <w:t>Tổng kết đánh giá kết quả học tập và trưng bày sản phẩm Robotics.</w:t>
             </w:r>
@@ -3798,6 +4126,7 @@
           <w:i/>
           <w:iCs/>
           <w:sz w:val="26"/>
+          <w:rFonts w:ascii="Times New Roman" w:hAnsi="Times New Roman" w:cs="Times New Roman"/>
         </w:rPr>
         <w:t xml:space="preserve">(1) </w:t>
       </w:r>
@@ -3807,6 +4136,7 @@
           <w:i/>
           <w:iCs/>
           <w:sz w:val="26"/>
+          <w:rFonts w:ascii="Times New Roman" w:hAnsi="Times New Roman" w:cs="Times New Roman"/>
         </w:rPr>
         <w:t>Tên bài học/chuyên đề được xây dựng từ nội dung/chủ đề/chuyên đề (được lấy nguyên hoặc thiết kế lại phù hợp với điều kiện thực tế của trường) theo chương trinh, sách giáo khoa môn học/hoạt động giáo dục</w:t>
       </w:r>
@@ -3824,6 +4154,7 @@
           <w:i/>
           <w:iCs/>
           <w:sz w:val="26"/>
+          <w:rFonts w:ascii="Times New Roman" w:hAnsi="Times New Roman" w:cs="Times New Roman"/>
         </w:rPr>
         <w:t>(2) Số tiết được sử dụng để thực hiện bài học, chuyên đề</w:t>
       </w:r>
@@ -3841,6 +4172,7 @@
           <w:i/>
           <w:iCs/>
           <w:sz w:val="26"/>
+          <w:rFonts w:ascii="Times New Roman" w:hAnsi="Times New Roman" w:cs="Times New Roman"/>
         </w:rPr>
         <w:t>(3) Yêu cầu cần đạt theo các đơn vị bài học, chủ đề và xác định yêu cầu cần đạt</w:t>
       </w:r>
@@ -3858,6 +4190,7 @@
           <w:b/>
           <w:bCs/>
           <w:sz w:val="26"/>
+          <w:rFonts w:ascii="Times New Roman" w:hAnsi="Times New Roman" w:cs="Times New Roman"/>
         </w:rPr>
         <w:t>2. Kiểm tra, đánh giá định kì</w:t>
       </w:r>
@@ -3875,6 +4208,7 @@
           <w:b/>
           <w:bCs/>
           <w:sz w:val="26"/>
+          <w:rFonts w:ascii="Times New Roman" w:hAnsi="Times New Roman" w:cs="Times New Roman"/>
         </w:rPr>
         <w:t>Môn Tin lớp 5</w:t>
       </w:r>
@@ -3917,6 +4251,7 @@
               <w:rPr>
                 <w:rFonts w:ascii="Times New Roman" w:hAnsi="Times New Roman"/>
                 <w:sz w:val="26"/>
+                <w:rFonts w:ascii="Times New Roman" w:hAnsi="Times New Roman" w:cs="Times New Roman"/>
               </w:rPr>
             </w:r>
             <w:r>
@@ -3924,6 +4259,7 @@
                 <w:rFonts w:ascii="Times New Roman" w:hAnsi="Times New Roman"/>
                 <w:b/>
                 <w:sz w:val="26"/>
+                <w:rFonts w:ascii="Times New Roman" w:hAnsi="Times New Roman" w:cs="Times New Roman"/>
               </w:rPr>
               <w:t>Bài kiểm tra, đánh giá</w:t>
             </w:r>
@@ -3942,6 +4278,7 @@
               <w:rPr>
                 <w:rFonts w:ascii="Times New Roman" w:hAnsi="Times New Roman"/>
                 <w:sz w:val="26"/>
+                <w:rFonts w:ascii="Times New Roman" w:hAnsi="Times New Roman" w:cs="Times New Roman"/>
               </w:rPr>
             </w:r>
             <w:r>
@@ -3949,6 +4286,7 @@
                 <w:rFonts w:ascii="Times New Roman" w:hAnsi="Times New Roman"/>
                 <w:b/>
                 <w:sz w:val="26"/>
+                <w:rFonts w:ascii="Times New Roman" w:hAnsi="Times New Roman" w:cs="Times New Roman"/>
               </w:rPr>
               <w:t>Thời gian (1)</w:t>
             </w:r>
@@ -3967,6 +4305,7 @@
               <w:rPr>
                 <w:rFonts w:ascii="Times New Roman" w:hAnsi="Times New Roman"/>
                 <w:sz w:val="26"/>
+                <w:rFonts w:ascii="Times New Roman" w:hAnsi="Times New Roman" w:cs="Times New Roman"/>
               </w:rPr>
             </w:r>
             <w:r>
@@ -3974,6 +4313,7 @@
                 <w:rFonts w:ascii="Times New Roman" w:hAnsi="Times New Roman"/>
                 <w:b/>
                 <w:sz w:val="26"/>
+                <w:rFonts w:ascii="Times New Roman" w:hAnsi="Times New Roman" w:cs="Times New Roman"/>
               </w:rPr>
               <w:t>Thời điểm (2)</w:t>
             </w:r>
@@ -3992,6 +4332,7 @@
               <w:rPr>
                 <w:rFonts w:ascii="Times New Roman" w:hAnsi="Times New Roman"/>
                 <w:sz w:val="26"/>
+                <w:rFonts w:ascii="Times New Roman" w:hAnsi="Times New Roman" w:cs="Times New Roman"/>
               </w:rPr>
             </w:r>
             <w:r>
@@ -3999,6 +4340,7 @@
                 <w:rFonts w:ascii="Times New Roman" w:hAnsi="Times New Roman"/>
                 <w:b/>
                 <w:sz w:val="26"/>
+                <w:rFonts w:ascii="Times New Roman" w:hAnsi="Times New Roman" w:cs="Times New Roman"/>
               </w:rPr>
               <w:t>Yêu cầu cần đạt (3)</w:t>
             </w:r>
@@ -4017,6 +4359,7 @@
               <w:rPr>
                 <w:rFonts w:ascii="Times New Roman" w:hAnsi="Times New Roman"/>
                 <w:sz w:val="26"/>
+                <w:rFonts w:ascii="Times New Roman" w:hAnsi="Times New Roman" w:cs="Times New Roman"/>
               </w:rPr>
             </w:r>
             <w:r>
@@ -4024,6 +4367,7 @@
                 <w:rFonts w:ascii="Times New Roman" w:hAnsi="Times New Roman"/>
                 <w:b/>
                 <w:sz w:val="26"/>
+                <w:rFonts w:ascii="Times New Roman" w:hAnsi="Times New Roman" w:cs="Times New Roman"/>
               </w:rPr>
               <w:t>Hình thức (4)</w:t>
             </w:r>
@@ -4046,6 +4390,7 @@
               <w:rPr>
                 <w:rFonts w:ascii="Times New Roman" w:hAnsi="Times New Roman"/>
                 <w:sz w:val="26"/>
+                <w:rFonts w:ascii="Times New Roman" w:hAnsi="Times New Roman" w:cs="Times New Roman"/>
               </w:rPr>
             </w:r>
             <w:r>
@@ -4053,6 +4398,7 @@
                 <w:rFonts w:ascii="Times New Roman" w:hAnsi="Times New Roman"/>
                 <w:b/>
                 <w:sz w:val="26"/>
+                <w:rFonts w:ascii="Times New Roman" w:hAnsi="Times New Roman" w:cs="Times New Roman"/>
               </w:rPr>
               <w:t>Đánh giá định kỳ 1</w:t>
             </w:r>
@@ -4071,13 +4417,15 @@
               <w:rPr>
                 <w:rFonts w:ascii="Times New Roman" w:hAnsi="Times New Roman"/>
                 <w:sz w:val="26"/>
-              </w:rPr>
-            </w:r>
-            <w:r>
-              <w:rPr>
-                <w:rFonts w:ascii="Times New Roman" w:hAnsi="Times New Roman"/>
-                <w:b w:val="0"/>
-                <w:sz w:val="26"/>
+                <w:rFonts w:ascii="Times New Roman" w:hAnsi="Times New Roman" w:cs="Times New Roman"/>
+              </w:rPr>
+            </w:r>
+            <w:r>
+              <w:rPr>
+                <w:rFonts w:ascii="Times New Roman" w:hAnsi="Times New Roman"/>
+                <w:b w:val="0"/>
+                <w:sz w:val="26"/>
+                <w:rFonts w:ascii="Times New Roman" w:hAnsi="Times New Roman" w:cs="Times New Roman"/>
               </w:rPr>
               <w:t>35 phút</w:t>
             </w:r>
@@ -4096,13 +4444,15 @@
               <w:rPr>
                 <w:rFonts w:ascii="Times New Roman" w:hAnsi="Times New Roman"/>
                 <w:sz w:val="26"/>
-              </w:rPr>
-            </w:r>
-            <w:r>
-              <w:rPr>
-                <w:rFonts w:ascii="Times New Roman" w:hAnsi="Times New Roman"/>
-                <w:b w:val="0"/>
-                <w:sz w:val="26"/>
+                <w:rFonts w:ascii="Times New Roman" w:hAnsi="Times New Roman" w:cs="Times New Roman"/>
+              </w:rPr>
+            </w:r>
+            <w:r>
+              <w:rPr>
+                <w:rFonts w:ascii="Times New Roman" w:hAnsi="Times New Roman"/>
+                <w:b w:val="0"/>
+                <w:sz w:val="26"/>
+                <w:rFonts w:ascii="Times New Roman" w:hAnsi="Times New Roman" w:cs="Times New Roman"/>
               </w:rPr>
               <w:t>Tuần 10</w:t>
             </w:r>
@@ -4120,13 +4470,15 @@
               <w:rPr>
                 <w:rFonts w:ascii="Times New Roman" w:hAnsi="Times New Roman"/>
                 <w:sz w:val="26"/>
-              </w:rPr>
-            </w:r>
-            <w:r>
-              <w:rPr>
-                <w:rFonts w:ascii="Times New Roman" w:hAnsi="Times New Roman"/>
-                <w:b w:val="0"/>
-                <w:sz w:val="26"/>
+                <w:rFonts w:ascii="Times New Roman" w:hAnsi="Times New Roman" w:cs="Times New Roman"/>
+              </w:rPr>
+            </w:r>
+            <w:r>
+              <w:rPr>
+                <w:rFonts w:ascii="Times New Roman" w:hAnsi="Times New Roman"/>
+                <w:b w:val="0"/>
+                <w:sz w:val="26"/>
+                <w:rFonts w:ascii="Times New Roman" w:hAnsi="Times New Roman" w:cs="Times New Roman"/>
               </w:rPr>
               <w:t>Nắm vững kĩ năng lắp ráp mô hình theo hướng dẫn, nhận biết các linh kiện cơ bản và vận hành robot đơn giản.</w:t>
             </w:r>
@@ -4144,13 +4496,15 @@
               <w:rPr>
                 <w:rFonts w:ascii="Times New Roman" w:hAnsi="Times New Roman"/>
                 <w:sz w:val="26"/>
-              </w:rPr>
-            </w:r>
-            <w:r>
-              <w:rPr>
-                <w:rFonts w:ascii="Times New Roman" w:hAnsi="Times New Roman"/>
-                <w:b w:val="0"/>
-                <w:sz w:val="26"/>
+                <w:rFonts w:ascii="Times New Roman" w:hAnsi="Times New Roman" w:cs="Times New Roman"/>
+              </w:rPr>
+            </w:r>
+            <w:r>
+              <w:rPr>
+                <w:rFonts w:ascii="Times New Roman" w:hAnsi="Times New Roman"/>
+                <w:b w:val="0"/>
+                <w:sz w:val="26"/>
+                <w:rFonts w:ascii="Times New Roman" w:hAnsi="Times New Roman" w:cs="Times New Roman"/>
               </w:rPr>
               <w:t>Thực hành lắp ráp và vận hành robot tại lớp</w:t>
             </w:r>
@@ -4173,6 +4527,7 @@
               <w:rPr>
                 <w:rFonts w:ascii="Times New Roman" w:hAnsi="Times New Roman"/>
                 <w:sz w:val="26"/>
+                <w:rFonts w:ascii="Times New Roman" w:hAnsi="Times New Roman" w:cs="Times New Roman"/>
               </w:rPr>
             </w:r>
             <w:r>
@@ -4180,6 +4535,7 @@
                 <w:rFonts w:ascii="Times New Roman" w:hAnsi="Times New Roman"/>
                 <w:b/>
                 <w:sz w:val="26"/>
+                <w:rFonts w:ascii="Times New Roman" w:hAnsi="Times New Roman" w:cs="Times New Roman"/>
               </w:rPr>
               <w:t>Đánh giá định kỳ 2</w:t>
             </w:r>
@@ -4198,13 +4554,15 @@
               <w:rPr>
                 <w:rFonts w:ascii="Times New Roman" w:hAnsi="Times New Roman"/>
                 <w:sz w:val="26"/>
-              </w:rPr>
-            </w:r>
-            <w:r>
-              <w:rPr>
-                <w:rFonts w:ascii="Times New Roman" w:hAnsi="Times New Roman"/>
-                <w:b w:val="0"/>
-                <w:sz w:val="26"/>
+                <w:rFonts w:ascii="Times New Roman" w:hAnsi="Times New Roman" w:cs="Times New Roman"/>
+              </w:rPr>
+            </w:r>
+            <w:r>
+              <w:rPr>
+                <w:rFonts w:ascii="Times New Roman" w:hAnsi="Times New Roman"/>
+                <w:b w:val="0"/>
+                <w:sz w:val="26"/>
+                <w:rFonts w:ascii="Times New Roman" w:hAnsi="Times New Roman" w:cs="Times New Roman"/>
               </w:rPr>
               <w:t>35 phút</w:t>
             </w:r>
@@ -4223,13 +4581,15 @@
               <w:rPr>
                 <w:rFonts w:ascii="Times New Roman" w:hAnsi="Times New Roman"/>
                 <w:sz w:val="26"/>
-              </w:rPr>
-            </w:r>
-            <w:r>
-              <w:rPr>
-                <w:rFonts w:ascii="Times New Roman" w:hAnsi="Times New Roman"/>
-                <w:b w:val="0"/>
-                <w:sz w:val="26"/>
+                <w:rFonts w:ascii="Times New Roman" w:hAnsi="Times New Roman" w:cs="Times New Roman"/>
+              </w:rPr>
+            </w:r>
+            <w:r>
+              <w:rPr>
+                <w:rFonts w:ascii="Times New Roman" w:hAnsi="Times New Roman"/>
+                <w:b w:val="0"/>
+                <w:sz w:val="26"/>
+                <w:rFonts w:ascii="Times New Roman" w:hAnsi="Times New Roman" w:cs="Times New Roman"/>
               </w:rPr>
               <w:t>Tuần 19</w:t>
             </w:r>
@@ -4247,13 +4607,15 @@
               <w:rPr>
                 <w:rFonts w:ascii="Times New Roman" w:hAnsi="Times New Roman"/>
                 <w:sz w:val="26"/>
-              </w:rPr>
-            </w:r>
-            <w:r>
-              <w:rPr>
-                <w:rFonts w:ascii="Times New Roman" w:hAnsi="Times New Roman"/>
-                <w:b w:val="0"/>
-                <w:sz w:val="26"/>
+                <w:rFonts w:ascii="Times New Roman" w:hAnsi="Times New Roman" w:cs="Times New Roman"/>
+              </w:rPr>
+            </w:r>
+            <w:r>
+              <w:rPr>
+                <w:rFonts w:ascii="Times New Roman" w:hAnsi="Times New Roman"/>
+                <w:b w:val="0"/>
+                <w:sz w:val="26"/>
+                <w:rFonts w:ascii="Times New Roman" w:hAnsi="Times New Roman" w:cs="Times New Roman"/>
               </w:rPr>
               <w:t>Nắm vững kĩ năng lắp ráp nâng cao, giải thích nguyên lý hoạt động mô phỏng và vận hành robot hoàn thành nhiệm vụ.</w:t>
             </w:r>
@@ -4271,13 +4633,15 @@
               <w:rPr>
                 <w:rFonts w:ascii="Times New Roman" w:hAnsi="Times New Roman"/>
                 <w:sz w:val="26"/>
-              </w:rPr>
-            </w:r>
-            <w:r>
-              <w:rPr>
-                <w:rFonts w:ascii="Times New Roman" w:hAnsi="Times New Roman"/>
-                <w:b w:val="0"/>
-                <w:sz w:val="26"/>
+                <w:rFonts w:ascii="Times New Roman" w:hAnsi="Times New Roman" w:cs="Times New Roman"/>
+              </w:rPr>
+            </w:r>
+            <w:r>
+              <w:rPr>
+                <w:rFonts w:ascii="Times New Roman" w:hAnsi="Times New Roman"/>
+                <w:b w:val="0"/>
+                <w:sz w:val="26"/>
+                <w:rFonts w:ascii="Times New Roman" w:hAnsi="Times New Roman" w:cs="Times New Roman"/>
               </w:rPr>
               <w:t>Thực hành làm việc nhóm và thử nghiệm robot</w:t>
             </w:r>
@@ -4300,6 +4664,7 @@
               <w:rPr>
                 <w:rFonts w:ascii="Times New Roman" w:hAnsi="Times New Roman"/>
                 <w:sz w:val="26"/>
+                <w:rFonts w:ascii="Times New Roman" w:hAnsi="Times New Roman" w:cs="Times New Roman"/>
               </w:rPr>
             </w:r>
             <w:r>
@@ -4307,6 +4672,7 @@
                 <w:rFonts w:ascii="Times New Roman" w:hAnsi="Times New Roman"/>
                 <w:b/>
                 <w:sz w:val="26"/>
+                <w:rFonts w:ascii="Times New Roman" w:hAnsi="Times New Roman" w:cs="Times New Roman"/>
               </w:rPr>
               <w:t>Đánh giá định kỳ 3</w:t>
             </w:r>
@@ -4325,13 +4691,15 @@
               <w:rPr>
                 <w:rFonts w:ascii="Times New Roman" w:hAnsi="Times New Roman"/>
                 <w:sz w:val="26"/>
-              </w:rPr>
-            </w:r>
-            <w:r>
-              <w:rPr>
-                <w:rFonts w:ascii="Times New Roman" w:hAnsi="Times New Roman"/>
-                <w:b w:val="0"/>
-                <w:sz w:val="26"/>
+                <w:rFonts w:ascii="Times New Roman" w:hAnsi="Times New Roman" w:cs="Times New Roman"/>
+              </w:rPr>
+            </w:r>
+            <w:r>
+              <w:rPr>
+                <w:rFonts w:ascii="Times New Roman" w:hAnsi="Times New Roman"/>
+                <w:b w:val="0"/>
+                <w:sz w:val="26"/>
+                <w:rFonts w:ascii="Times New Roman" w:hAnsi="Times New Roman" w:cs="Times New Roman"/>
               </w:rPr>
               <w:t>35 phút</w:t>
             </w:r>
@@ -4350,13 +4718,15 @@
               <w:rPr>
                 <w:rFonts w:ascii="Times New Roman" w:hAnsi="Times New Roman"/>
                 <w:sz w:val="26"/>
-              </w:rPr>
-            </w:r>
-            <w:r>
-              <w:rPr>
-                <w:rFonts w:ascii="Times New Roman" w:hAnsi="Times New Roman"/>
-                <w:b w:val="0"/>
-                <w:sz w:val="26"/>
+                <w:rFonts w:ascii="Times New Roman" w:hAnsi="Times New Roman" w:cs="Times New Roman"/>
+              </w:rPr>
+            </w:r>
+            <w:r>
+              <w:rPr>
+                <w:rFonts w:ascii="Times New Roman" w:hAnsi="Times New Roman"/>
+                <w:b w:val="0"/>
+                <w:sz w:val="26"/>
+                <w:rFonts w:ascii="Times New Roman" w:hAnsi="Times New Roman" w:cs="Times New Roman"/>
               </w:rPr>
               <w:t>Tuần 28</w:t>
             </w:r>
@@ -4374,13 +4744,15 @@
               <w:rPr>
                 <w:rFonts w:ascii="Times New Roman" w:hAnsi="Times New Roman"/>
                 <w:sz w:val="26"/>
-              </w:rPr>
-            </w:r>
-            <w:r>
-              <w:rPr>
-                <w:rFonts w:ascii="Times New Roman" w:hAnsi="Times New Roman"/>
-                <w:b w:val="0"/>
-                <w:sz w:val="26"/>
+                <w:rFonts w:ascii="Times New Roman" w:hAnsi="Times New Roman" w:cs="Times New Roman"/>
+              </w:rPr>
+            </w:r>
+            <w:r>
+              <w:rPr>
+                <w:rFonts w:ascii="Times New Roman" w:hAnsi="Times New Roman"/>
+                <w:b w:val="0"/>
+                <w:sz w:val="26"/>
+                <w:rFonts w:ascii="Times New Roman" w:hAnsi="Times New Roman" w:cs="Times New Roman"/>
               </w:rPr>
               <w:t>Vận hành robot độc lập, kết hợp động cơ và cảm biến, thử nghiệm và điều chỉnh robot theo yêu cầu bài học.</w:t>
             </w:r>
@@ -4398,13 +4770,15 @@
               <w:rPr>
                 <w:rFonts w:ascii="Times New Roman" w:hAnsi="Times New Roman"/>
                 <w:sz w:val="26"/>
-              </w:rPr>
-            </w:r>
-            <w:r>
-              <w:rPr>
-                <w:rFonts w:ascii="Times New Roman" w:hAnsi="Times New Roman"/>
-                <w:b w:val="0"/>
-                <w:sz w:val="26"/>
+                <w:rFonts w:ascii="Times New Roman" w:hAnsi="Times New Roman" w:cs="Times New Roman"/>
+              </w:rPr>
+            </w:r>
+            <w:r>
+              <w:rPr>
+                <w:rFonts w:ascii="Times New Roman" w:hAnsi="Times New Roman"/>
+                <w:b w:val="0"/>
+                <w:sz w:val="26"/>
+                <w:rFonts w:ascii="Times New Roman" w:hAnsi="Times New Roman" w:cs="Times New Roman"/>
               </w:rPr>
               <w:t>Thực hành giải quyết nhiệm vụ Robotics</w:t>
             </w:r>
@@ -4427,6 +4801,7 @@
               <w:rPr>
                 <w:rFonts w:ascii="Times New Roman" w:hAnsi="Times New Roman"/>
                 <w:sz w:val="26"/>
+                <w:rFonts w:ascii="Times New Roman" w:hAnsi="Times New Roman" w:cs="Times New Roman"/>
               </w:rPr>
             </w:r>
             <w:r>
@@ -4434,6 +4809,7 @@
                 <w:rFonts w:ascii="Times New Roman" w:hAnsi="Times New Roman"/>
                 <w:b/>
                 <w:sz w:val="26"/>
+                <w:rFonts w:ascii="Times New Roman" w:hAnsi="Times New Roman" w:cs="Times New Roman"/>
               </w:rPr>
               <w:t>Đánh giá định kỳ 4</w:t>
             </w:r>
@@ -4452,13 +4828,15 @@
               <w:rPr>
                 <w:rFonts w:ascii="Times New Roman" w:hAnsi="Times New Roman"/>
                 <w:sz w:val="26"/>
-              </w:rPr>
-            </w:r>
-            <w:r>
-              <w:rPr>
-                <w:rFonts w:ascii="Times New Roman" w:hAnsi="Times New Roman"/>
-                <w:b w:val="0"/>
-                <w:sz w:val="26"/>
+                <w:rFonts w:ascii="Times New Roman" w:hAnsi="Times New Roman" w:cs="Times New Roman"/>
+              </w:rPr>
+            </w:r>
+            <w:r>
+              <w:rPr>
+                <w:rFonts w:ascii="Times New Roman" w:hAnsi="Times New Roman"/>
+                <w:b w:val="0"/>
+                <w:sz w:val="26"/>
+                <w:rFonts w:ascii="Times New Roman" w:hAnsi="Times New Roman" w:cs="Times New Roman"/>
               </w:rPr>
               <w:t>35 phút</w:t>
             </w:r>
@@ -4477,13 +4855,15 @@
               <w:rPr>
                 <w:rFonts w:ascii="Times New Roman" w:hAnsi="Times New Roman"/>
                 <w:sz w:val="26"/>
-              </w:rPr>
-            </w:r>
-            <w:r>
-              <w:rPr>
-                <w:rFonts w:ascii="Times New Roman" w:hAnsi="Times New Roman"/>
-                <w:b w:val="0"/>
-                <w:sz w:val="26"/>
+                <w:rFonts w:ascii="Times New Roman" w:hAnsi="Times New Roman" w:cs="Times New Roman"/>
+              </w:rPr>
+            </w:r>
+            <w:r>
+              <w:rPr>
+                <w:rFonts w:ascii="Times New Roman" w:hAnsi="Times New Roman"/>
+                <w:b w:val="0"/>
+                <w:sz w:val="26"/>
+                <w:rFonts w:ascii="Times New Roman" w:hAnsi="Times New Roman" w:cs="Times New Roman"/>
               </w:rPr>
               <w:t>Tuần 34</w:t>
             </w:r>
@@ -4501,13 +4881,15 @@
               <w:rPr>
                 <w:rFonts w:ascii="Times New Roman" w:hAnsi="Times New Roman"/>
                 <w:sz w:val="26"/>
-              </w:rPr>
-            </w:r>
-            <w:r>
-              <w:rPr>
-                <w:rFonts w:ascii="Times New Roman" w:hAnsi="Times New Roman"/>
-                <w:b w:val="0"/>
-                <w:sz w:val="26"/>
+                <w:rFonts w:ascii="Times New Roman" w:hAnsi="Times New Roman" w:cs="Times New Roman"/>
+              </w:rPr>
+            </w:r>
+            <w:r>
+              <w:rPr>
+                <w:rFonts w:ascii="Times New Roman" w:hAnsi="Times New Roman"/>
+                <w:b w:val="0"/>
+                <w:sz w:val="26"/>
+                <w:rFonts w:ascii="Times New Roman" w:hAnsi="Times New Roman" w:cs="Times New Roman"/>
               </w:rPr>
               <w:t>Tổng hợp kiến thức cả năm, chủ động sáng tạo cải tiến mô hình robot và thuyết trình sản phẩm trước tập thể.</w:t>
             </w:r>
@@ -4525,13 +4907,15 @@
               <w:rPr>
                 <w:rFonts w:ascii="Times New Roman" w:hAnsi="Times New Roman"/>
                 <w:sz w:val="26"/>
-              </w:rPr>
-            </w:r>
-            <w:r>
-              <w:rPr>
-                <w:rFonts w:ascii="Times New Roman" w:hAnsi="Times New Roman"/>
-                <w:b w:val="0"/>
-                <w:sz w:val="26"/>
+                <w:rFonts w:ascii="Times New Roman" w:hAnsi="Times New Roman" w:cs="Times New Roman"/>
+              </w:rPr>
+            </w:r>
+            <w:r>
+              <w:rPr>
+                <w:rFonts w:ascii="Times New Roman" w:hAnsi="Times New Roman"/>
+                <w:b w:val="0"/>
+                <w:sz w:val="26"/>
+                <w:rFonts w:ascii="Times New Roman" w:hAnsi="Times New Roman" w:cs="Times New Roman"/>
               </w:rPr>
               <w:t>Thực hành tạo sản phẩm sáng tạo &amp; Thuyết trình</w:t>
             </w:r>
@@ -4566,6 +4950,7 @@
           <w:iCs/>
           <w:color w:val="000000"/>
           <w:sz w:val="26"/>
+          <w:rFonts w:ascii="Times New Roman" w:hAnsi="Times New Roman" w:cs="Times New Roman"/>
         </w:rPr>
         <w:t>Thời gian làm bài kiểm tra, đánh giá</w:t>
       </w:r>
@@ -4597,6 +4982,7 @@
           <w:iCs/>
           <w:color w:val="000000"/>
           <w:sz w:val="26"/>
+          <w:rFonts w:ascii="Times New Roman" w:hAnsi="Times New Roman" w:cs="Times New Roman"/>
         </w:rPr>
         <w:t>Tuần thứ, tháng, năm thực hiện bài kiểm tra đánh giá</w:t>
       </w:r>
@@ -4628,6 +5014,7 @@
           <w:iCs/>
           <w:color w:val="000000"/>
           <w:sz w:val="26"/>
+          <w:rFonts w:ascii="Times New Roman" w:hAnsi="Times New Roman" w:cs="Times New Roman"/>
         </w:rPr>
         <w:t>Yêu cầu cần đạt thời điểm kiểm tra đánh giá (Theo phân phối chương trình)</w:t>
       </w:r>
@@ -4658,6 +5045,7 @@
           <w:iCs/>
           <w:color w:val="000000"/>
           <w:sz w:val="26"/>
+          <w:rFonts w:ascii="Times New Roman" w:hAnsi="Times New Roman" w:cs="Times New Roman"/>
         </w:rPr>
         <w:lastRenderedPageBreak/>
         <w:t>Hình thức bài kiểm tra đánh giá: Viết (trên giấy hoặc máy tính); bài thực hành; dự án học tập</w:t>
@@ -4676,6 +5064,7 @@
           <w:b/>
           <w:bCs/>
           <w:sz w:val="26"/>
+          <w:rFonts w:ascii="Times New Roman" w:hAnsi="Times New Roman" w:cs="Times New Roman"/>
         </w:rPr>
         <w:t>III. Các nội dung khác (Nếu có)</w:t>
       </w:r>
@@ -4735,6 +5124,7 @@
                 <w:bCs/>
                 <w:sz w:val="26"/>
                 <w:szCs w:val="26"/>
+                <w:rFonts w:ascii="Times New Roman" w:hAnsi="Times New Roman" w:cs="Times New Roman"/>
               </w:rPr>
               <w:t>TỔ TRƯỞNG</w:t>
             </w:r>
@@ -4757,6 +5147,7 @@
                 <w:iCs/>
                 <w:sz w:val="26"/>
                 <w:szCs w:val="26"/>
+                <w:rFonts w:ascii="Times New Roman" w:hAnsi="Times New Roman" w:cs="Times New Roman"/>
               </w:rPr>
               <w:t>(Ký, ghi rõ họ tên)</w:t>
             </w:r>
@@ -4784,6 +5175,7 @@
                 <w:iCs/>
                 <w:sz w:val="26"/>
                 <w:szCs w:val="26"/>
+                <w:rFonts w:ascii="Times New Roman" w:hAnsi="Times New Roman" w:cs="Times New Roman"/>
               </w:rPr>
               <w:t>Hoài Đức, ngày    tháng     năm 2026</w:t>
             </w:r>
@@ -4806,6 +5198,7 @@
                 <w:bCs/>
                 <w:sz w:val="26"/>
                 <w:szCs w:val="26"/>
+                <w:rFonts w:ascii="Times New Roman" w:hAnsi="Times New Roman" w:cs="Times New Roman"/>
               </w:rPr>
               <w:t>HIỆU TRƯỞNG</w:t>
             </w:r>
@@ -4830,6 +5223,7 @@
                 <w:iCs/>
                 <w:sz w:val="26"/>
                 <w:szCs w:val="26"/>
+                <w:rFonts w:ascii="Times New Roman" w:hAnsi="Times New Roman" w:cs="Times New Roman"/>
               </w:rPr>
               <w:t>(</w:t>
             </w:r>
@@ -4840,6 +5234,7 @@
                 <w:iCs/>
                 <w:sz w:val="26"/>
                 <w:szCs w:val="26"/>
+                <w:rFonts w:ascii="Times New Roman" w:hAnsi="Times New Roman" w:cs="Times New Roman"/>
               </w:rPr>
               <w:t>Ký và ghi rõ họ tên)</w:t>
             </w:r>

</xml_diff>